<commit_message>
feat: Integrate interactive Secure Triage dashboard and update landing page mockups
</commit_message>
<xml_diff>
--- a/PP_Notes.docx
+++ b/PP_Notes.docx
@@ -75,7 +75,7 @@
           <w:noProof/>
           <w:kern w:val="0"/>
         </w:rPr>
-        <w:pict w14:anchorId="240674F2">
+        <w:pict w14:anchorId="785F241A">
           <v:rect id="_x0000_i1029" alt="" style="width:711pt;height:.75pt;mso-width-percent:0;mso-height-percent:0;mso-width-percent:0;mso-height-percent:0" o:hrpct="0" o:hralign="center" o:hrstd="t" o:hr="t" fillcolor="#a0a0a0" stroked="f"/>
         </w:pict>
       </w:r>
@@ -658,7 +658,7 @@
           </mc:Choice>
           <mc:Fallback>
             <w:pict>
-              <v:rect w14:anchorId="69450E6D" id="Rectangle 1" o:spid="_x0000_s1026" style="width:24.3pt;height:24.3pt;visibility:visible;mso-wrap-style:square;mso-left-percent:-10001;mso-top-percent:-10001;mso-position-horizontal:absolute;mso-position-horizontal-relative:char;mso-position-vertical:absolute;mso-position-vertical-relative:line;mso-left-percent:-10001;mso-top-percent:-10001;v-text-anchor:top" o:gfxdata="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" filled="f" stroked="f">
+              <v:rect w14:anchorId="1AC53D63" id="Rectangle 1" o:spid="_x0000_s1026" style="width:24.3pt;height:24.3pt;visibility:visible;mso-wrap-style:square;mso-left-percent:-10001;mso-top-percent:-10001;mso-position-horizontal:absolute;mso-position-horizontal-relative:char;mso-position-vertical:absolute;mso-position-vertical-relative:line;mso-left-percent:-10001;mso-top-percent:-10001;v-text-anchor:top" o:gfxdata="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" filled="f" stroked="f">
                 <o:lock v:ext="edit" aspectratio="t"/>
                 <w10:anchorlock/>
               </v:rect>
@@ -792,7 +792,7 @@
           <w:noProof/>
           <w:kern w:val="0"/>
         </w:rPr>
-        <w:pict w14:anchorId="2969D07F">
+        <w:pict w14:anchorId="3131FF9F">
           <v:rect id="_x0000_i1028" alt="" style="width:711pt;height:.75pt;mso-width-percent:0;mso-height-percent:0;mso-width-percent:0;mso-height-percent:0" o:hrpct="0" o:hralign="center" o:hrstd="t" o:hr="t" fillcolor="#a0a0a0" stroked="f"/>
         </w:pict>
       </w:r>
@@ -1114,7 +1114,7 @@
           <w:noProof/>
           <w:kern w:val="0"/>
         </w:rPr>
-        <w:pict w14:anchorId="3323CFCE">
+        <w:pict w14:anchorId="55669146">
           <v:rect id="_x0000_i1027" alt="" style="width:711pt;height:.75pt;mso-width-percent:0;mso-height-percent:0;mso-width-percent:0;mso-height-percent:0" o:hrpct="0" o:hralign="center" o:hrstd="t" o:hr="t" fillcolor="#a0a0a0" stroked="f"/>
         </w:pict>
       </w:r>
@@ -1389,7 +1389,7 @@
           <w:noProof/>
           <w:kern w:val="0"/>
         </w:rPr>
-        <w:pict w14:anchorId="6219E398">
+        <w:pict w14:anchorId="5FA3A6DC">
           <v:rect id="_x0000_i1026" alt="" style="width:711pt;height:.75pt;mso-width-percent:0;mso-height-percent:0;mso-width-percent:0;mso-height-percent:0" o:hrpct="0" o:hralign="center" o:hrstd="t" o:hr="t" fillcolor="#a0a0a0" stroked="f"/>
         </w:pict>
       </w:r>
@@ -1760,7 +1760,7 @@
           <w:noProof/>
           <w:kern w:val="0"/>
         </w:rPr>
-        <w:pict w14:anchorId="0E1138C8">
+        <w:pict w14:anchorId="1DD96421">
           <v:rect id="_x0000_i1025" alt="" style="width:711pt;height:.75pt;mso-width-percent:0;mso-height-percent:0;mso-width-percent:0;mso-height-percent:0" o:hrpct="0" o:hralign="center" o:hrstd="t" o:hr="t" fillcolor="#a0a0a0" stroked="f"/>
         </w:pict>
       </w:r>
@@ -1963,6 +1963,1668 @@
           <w14:ligatures w14:val="none"/>
         </w:rPr>
         <w:t>Alternatively, API keys to compliance automation platforms (such as Vanta or Drata) to automatically check off active controls.</w:t>
+      </w:r>
+    </w:p>
+    <w:p>
+      <w:pPr>
+        <w:pBdr>
+          <w:top w:val="single" w:sz="2" w:space="0" w:color="auto"/>
+          <w:left w:val="single" w:sz="2" w:space="0" w:color="auto"/>
+          <w:bottom w:val="single" w:sz="2" w:space="0" w:color="auto"/>
+          <w:right w:val="single" w:sz="2" w:space="0" w:color="auto"/>
+        </w:pBdr>
+        <w:shd w:val="clear" w:color="auto" w:fill="F8F8F8"/>
+        <w:spacing w:before="100" w:beforeAutospacing="1" w:after="100" w:afterAutospacing="1" w:line="240" w:lineRule="auto"/>
+        <w:outlineLvl w:val="2"/>
+        <w:rPr>
+          <w:rFonts w:ascii="Arial" w:eastAsia="Times New Roman" w:hAnsi="Arial" w:cs="Arial"/>
+          <w:color w:val="3B3B3B"/>
+          <w:kern w:val="0"/>
+          <w:sz w:val="27"/>
+          <w:szCs w:val="27"/>
+          <w14:ligatures w14:val="none"/>
+        </w:rPr>
+      </w:pPr>
+      <w:r>
+        <w:rPr>
+          <w:rFonts w:ascii="Arial" w:eastAsia="Times New Roman" w:hAnsi="Arial" w:cs="Arial"/>
+          <w:color w:val="3B3B3B"/>
+          <w:kern w:val="0"/>
+          <w:sz w:val="27"/>
+          <w:szCs w:val="27"/>
+          <w14:ligatures w14:val="none"/>
+        </w:rPr>
+        <w:t>Summary of Completed Upgrades:</w:t>
+      </w:r>
+    </w:p>
+    <w:p>
+      <w:pPr>
+        <w:numPr>
+          <w:ilvl w:val="0"/>
+          <w:numId w:val="6"/>
+        </w:numPr>
+        <w:pBdr>
+          <w:top w:val="single" w:sz="2" w:space="0" w:color="auto"/>
+          <w:left w:val="single" w:sz="2" w:space="0" w:color="auto"/>
+          <w:bottom w:val="single" w:sz="2" w:space="0" w:color="auto"/>
+          <w:right w:val="single" w:sz="2" w:space="0" w:color="auto"/>
+        </w:pBdr>
+        <w:shd w:val="clear" w:color="auto" w:fill="F8F8F8"/>
+        <w:spacing w:after="0" w:line="240" w:lineRule="auto"/>
+        <w:rPr>
+          <w:rFonts w:ascii="Arial" w:eastAsia="Times New Roman" w:hAnsi="Arial" w:cs="Arial"/>
+          <w:color w:val="3B3B3B"/>
+          <w:kern w:val="0"/>
+          <w:sz w:val="20"/>
+          <w:szCs w:val="20"/>
+          <w14:ligatures w14:val="none"/>
+        </w:rPr>
+      </w:pPr>
+      <w:r>
+        <w:rPr>
+          <w:rFonts w:ascii="Apple Color Emoji" w:eastAsia="Times New Roman" w:hAnsi="Apple Color Emoji" w:cs="Apple Color Emoji"/>
+          <w:b/>
+          <w:bCs/>
+          <w:color w:val="3B3B3B"/>
+          <w:kern w:val="0"/>
+          <w:sz w:val="20"/>
+          <w:szCs w:val="20"/>
+          <w:bdr w:val="single" w:sz="2" w:space="0" w:color="auto" w:frame="1"/>
+          <w14:ligatures w14:val="none"/>
+        </w:rPr>
+        <w:t>🎛️</w:t>
+      </w:r>
+      <w:r>
+        <w:rPr>
+          <w:rFonts w:ascii="Arial" w:eastAsia="Times New Roman" w:hAnsi="Arial" w:cs="Arial"/>
+          <w:b/>
+          <w:bCs/>
+          <w:color w:val="3B3B3B"/>
+          <w:kern w:val="0"/>
+          <w:sz w:val="20"/>
+          <w:szCs w:val="20"/>
+          <w:bdr w:val="single" w:sz="2" w:space="0" w:color="auto" w:frame="1"/>
+          <w14:ligatures w14:val="none"/>
+        </w:rPr>
+        <w:t xml:space="preserve"> Dynamic View Mode Switcher</w:t>
+      </w:r>
+      <w:r>
+        <w:rPr>
+          <w:rFonts w:ascii="Arial" w:eastAsia="Times New Roman" w:hAnsi="Arial" w:cs="Arial"/>
+          <w:color w:val="3B3B3B"/>
+          <w:kern w:val="0"/>
+          <w:sz w:val="20"/>
+          <w:szCs w:val="20"/>
+          <w14:ligatures w14:val="none"/>
+        </w:rPr>
+        <w:t>:</w:t>
+      </w:r>
+    </w:p>
+    <w:p>
+      <w:pPr>
+        <w:numPr>
+          <w:ilvl w:val="1"/>
+          <w:numId w:val="6"/>
+        </w:numPr>
+        <w:pBdr>
+          <w:top w:val="single" w:sz="2" w:space="0" w:color="auto"/>
+          <w:left w:val="single" w:sz="2" w:space="0" w:color="auto"/>
+          <w:bottom w:val="single" w:sz="2" w:space="0" w:color="auto"/>
+          <w:right w:val="single" w:sz="2" w:space="0" w:color="auto"/>
+        </w:pBdr>
+        <w:shd w:val="clear" w:color="auto" w:fill="F8F8F8"/>
+        <w:spacing w:before="100" w:beforeAutospacing="1" w:after="100" w:afterAutospacing="1" w:line="240" w:lineRule="auto"/>
+        <w:rPr>
+          <w:rFonts w:ascii="Arial" w:eastAsia="Times New Roman" w:hAnsi="Arial" w:cs="Arial"/>
+          <w:color w:val="3B3B3B"/>
+          <w:kern w:val="0"/>
+          <w:sz w:val="20"/>
+          <w:szCs w:val="20"/>
+          <w14:ligatures w14:val="none"/>
+        </w:rPr>
+      </w:pPr>
+      <w:r>
+        <w:rPr>
+          <w:rFonts w:ascii="Arial" w:eastAsia="Times New Roman" w:hAnsi="Arial" w:cs="Arial"/>
+          <w:color w:val="3B3B3B"/>
+          <w:kern w:val="0"/>
+          <w:sz w:val="20"/>
+          <w:szCs w:val="20"/>
+          <w14:ligatures w14:val="none"/>
+        </w:rPr>
+        <w:t>Segmented button bar at the top of the dashboard toggles layouts:</w:t>
+      </w:r>
+    </w:p>
+    <w:p>
+      <w:pPr>
+        <w:numPr>
+          <w:ilvl w:val="2"/>
+          <w:numId w:val="6"/>
+        </w:numPr>
+        <w:pBdr>
+          <w:top w:val="single" w:sz="2" w:space="0" w:color="auto"/>
+          <w:left w:val="single" w:sz="2" w:space="0" w:color="auto"/>
+          <w:bottom w:val="single" w:sz="2" w:space="0" w:color="auto"/>
+          <w:right w:val="single" w:sz="2" w:space="0" w:color="auto"/>
+        </w:pBdr>
+        <w:shd w:val="clear" w:color="auto" w:fill="F8F8F8"/>
+        <w:spacing w:before="100" w:beforeAutospacing="1" w:after="100" w:afterAutospacing="1" w:line="240" w:lineRule="auto"/>
+        <w:rPr>
+          <w:rFonts w:ascii="Arial" w:eastAsia="Times New Roman" w:hAnsi="Arial" w:cs="Arial"/>
+          <w:color w:val="3B3B3B"/>
+          <w:kern w:val="0"/>
+          <w:sz w:val="20"/>
+          <w:szCs w:val="20"/>
+          <w14:ligatures w14:val="none"/>
+        </w:rPr>
+      </w:pPr>
+      <w:r>
+        <w:rPr>
+          <w:rFonts w:ascii="Arial" w:eastAsia="Times New Roman" w:hAnsi="Arial" w:cs="Arial"/>
+          <w:b/>
+          <w:bCs/>
+          <w:color w:val="3B3B3B"/>
+          <w:kern w:val="0"/>
+          <w:sz w:val="20"/>
+          <w:szCs w:val="20"/>
+          <w:bdr w:val="single" w:sz="2" w:space="0" w:color="auto" w:frame="1"/>
+          <w14:ligatures w14:val="none"/>
+        </w:rPr>
+        <w:t>Executive Cockpit (Default)</w:t>
+      </w:r>
+      <w:r>
+        <w:rPr>
+          <w:rFonts w:ascii="Arial" w:eastAsia="Times New Roman" w:hAnsi="Arial" w:cs="Arial"/>
+          <w:color w:val="3B3B3B"/>
+          <w:kern w:val="0"/>
+          <w:sz w:val="20"/>
+          <w:szCs w:val="20"/>
+          <w14:ligatures w14:val="none"/>
+        </w:rPr>
+        <w:t>: Premium compliance bars, half-donut posture gauges, and findings breakdown charts.</w:t>
+      </w:r>
+    </w:p>
+    <w:p>
+      <w:pPr>
+        <w:numPr>
+          <w:ilvl w:val="2"/>
+          <w:numId w:val="6"/>
+        </w:numPr>
+        <w:pBdr>
+          <w:top w:val="single" w:sz="2" w:space="0" w:color="auto"/>
+          <w:left w:val="single" w:sz="2" w:space="0" w:color="auto"/>
+          <w:bottom w:val="single" w:sz="2" w:space="0" w:color="auto"/>
+          <w:right w:val="single" w:sz="2" w:space="0" w:color="auto"/>
+        </w:pBdr>
+        <w:shd w:val="clear" w:color="auto" w:fill="F8F8F8"/>
+        <w:spacing w:before="100" w:beforeAutospacing="1" w:after="100" w:afterAutospacing="1" w:line="240" w:lineRule="auto"/>
+        <w:rPr>
+          <w:rFonts w:ascii="Arial" w:eastAsia="Times New Roman" w:hAnsi="Arial" w:cs="Arial"/>
+          <w:color w:val="3B3B3B"/>
+          <w:kern w:val="0"/>
+          <w:sz w:val="20"/>
+          <w:szCs w:val="20"/>
+          <w14:ligatures w14:val="none"/>
+        </w:rPr>
+      </w:pPr>
+      <w:r>
+        <w:rPr>
+          <w:rFonts w:ascii="Arial" w:eastAsia="Times New Roman" w:hAnsi="Arial" w:cs="Arial"/>
+          <w:b/>
+          <w:bCs/>
+          <w:color w:val="3B3B3B"/>
+          <w:kern w:val="0"/>
+          <w:sz w:val="20"/>
+          <w:szCs w:val="20"/>
+          <w:bdr w:val="single" w:sz="2" w:space="0" w:color="auto" w:frame="1"/>
+          <w14:ligatures w14:val="none"/>
+        </w:rPr>
+        <w:t>Tactical SOC Terminal</w:t>
+      </w:r>
+      <w:r>
+        <w:rPr>
+          <w:rFonts w:ascii="Arial" w:eastAsia="Times New Roman" w:hAnsi="Arial" w:cs="Arial"/>
+          <w:color w:val="3B3B3B"/>
+          <w:kern w:val="0"/>
+          <w:sz w:val="20"/>
+          <w:szCs w:val="20"/>
+          <w14:ligatures w14:val="none"/>
+        </w:rPr>
+        <w:t>: Focuses on continuous threat telemetry consoles, operational statistics, and simulated attack playbooks.</w:t>
+      </w:r>
+    </w:p>
+    <w:p>
+      <w:pPr>
+        <w:numPr>
+          <w:ilvl w:val="2"/>
+          <w:numId w:val="6"/>
+        </w:numPr>
+        <w:pBdr>
+          <w:top w:val="single" w:sz="2" w:space="0" w:color="auto"/>
+          <w:left w:val="single" w:sz="2" w:space="0" w:color="auto"/>
+          <w:bottom w:val="single" w:sz="2" w:space="0" w:color="auto"/>
+          <w:right w:val="single" w:sz="2" w:space="0" w:color="auto"/>
+        </w:pBdr>
+        <w:shd w:val="clear" w:color="auto" w:fill="F8F8F8"/>
+        <w:spacing w:before="100" w:beforeAutospacing="1" w:after="100" w:afterAutospacing="1" w:line="240" w:lineRule="auto"/>
+        <w:rPr>
+          <w:rFonts w:ascii="Arial" w:eastAsia="Times New Roman" w:hAnsi="Arial" w:cs="Arial"/>
+          <w:color w:val="3B3B3B"/>
+          <w:kern w:val="0"/>
+          <w:sz w:val="20"/>
+          <w:szCs w:val="20"/>
+          <w14:ligatures w14:val="none"/>
+        </w:rPr>
+      </w:pPr>
+      <w:r>
+        <w:rPr>
+          <w:rFonts w:ascii="Arial" w:eastAsia="Times New Roman" w:hAnsi="Arial" w:cs="Arial"/>
+          <w:b/>
+          <w:bCs/>
+          <w:color w:val="3B3B3B"/>
+          <w:kern w:val="0"/>
+          <w:sz w:val="20"/>
+          <w:szCs w:val="20"/>
+          <w:bdr w:val="single" w:sz="2" w:space="0" w:color="auto" w:frame="1"/>
+          <w14:ligatures w14:val="none"/>
+        </w:rPr>
+        <w:t>Compliance &amp; Directory</w:t>
+      </w:r>
+      <w:r>
+        <w:rPr>
+          <w:rFonts w:ascii="Arial" w:eastAsia="Times New Roman" w:hAnsi="Arial" w:cs="Arial"/>
+          <w:color w:val="3B3B3B"/>
+          <w:kern w:val="0"/>
+          <w:sz w:val="20"/>
+          <w:szCs w:val="20"/>
+          <w14:ligatures w14:val="none"/>
+        </w:rPr>
+        <w:t>: Shows detailed GRC checklists (NIST, SOC 2, ISO) and Zero Trust directory indicators (MFA progress dials, stale credential tallies).</w:t>
+      </w:r>
+    </w:p>
+    <w:p>
+      <w:pPr>
+        <w:numPr>
+          <w:ilvl w:val="0"/>
+          <w:numId w:val="6"/>
+        </w:numPr>
+        <w:pBdr>
+          <w:top w:val="single" w:sz="2" w:space="0" w:color="auto"/>
+          <w:left w:val="single" w:sz="2" w:space="0" w:color="auto"/>
+          <w:bottom w:val="single" w:sz="2" w:space="0" w:color="auto"/>
+          <w:right w:val="single" w:sz="2" w:space="0" w:color="auto"/>
+        </w:pBdr>
+        <w:shd w:val="clear" w:color="auto" w:fill="F8F8F8"/>
+        <w:spacing w:after="0" w:line="240" w:lineRule="auto"/>
+        <w:rPr>
+          <w:rFonts w:ascii="Arial" w:eastAsia="Times New Roman" w:hAnsi="Arial" w:cs="Arial"/>
+          <w:color w:val="3B3B3B"/>
+          <w:kern w:val="0"/>
+          <w:sz w:val="20"/>
+          <w:szCs w:val="20"/>
+          <w14:ligatures w14:val="none"/>
+        </w:rPr>
+      </w:pPr>
+      <w:r>
+        <w:rPr>
+          <w:rFonts w:ascii="Apple Color Emoji" w:eastAsia="Times New Roman" w:hAnsi="Apple Color Emoji" w:cs="Apple Color Emoji"/>
+          <w:b/>
+          <w:bCs/>
+          <w:color w:val="3B3B3B"/>
+          <w:kern w:val="0"/>
+          <w:sz w:val="20"/>
+          <w:szCs w:val="20"/>
+          <w:bdr w:val="single" w:sz="2" w:space="0" w:color="auto" w:frame="1"/>
+          <w14:ligatures w14:val="none"/>
+        </w:rPr>
+        <w:t>🚨</w:t>
+      </w:r>
+      <w:r>
+        <w:rPr>
+          <w:rFonts w:ascii="Arial" w:eastAsia="Times New Roman" w:hAnsi="Arial" w:cs="Arial"/>
+          <w:b/>
+          <w:bCs/>
+          <w:color w:val="3B3B3B"/>
+          <w:kern w:val="0"/>
+          <w:sz w:val="20"/>
+          <w:szCs w:val="20"/>
+          <w:bdr w:val="single" w:sz="2" w:space="0" w:color="auto" w:frame="1"/>
+          <w14:ligatures w14:val="none"/>
+        </w:rPr>
+        <w:t xml:space="preserve"> Interactive Threat Attack Simulation Sandbox</w:t>
+      </w:r>
+      <w:r>
+        <w:rPr>
+          <w:rFonts w:ascii="Arial" w:eastAsia="Times New Roman" w:hAnsi="Arial" w:cs="Arial"/>
+          <w:color w:val="3B3B3B"/>
+          <w:kern w:val="0"/>
+          <w:sz w:val="20"/>
+          <w:szCs w:val="20"/>
+          <w14:ligatures w14:val="none"/>
+        </w:rPr>
+        <w:t>:</w:t>
+      </w:r>
+    </w:p>
+    <w:p>
+      <w:pPr>
+        <w:numPr>
+          <w:ilvl w:val="1"/>
+          <w:numId w:val="6"/>
+        </w:numPr>
+        <w:pBdr>
+          <w:top w:val="single" w:sz="2" w:space="0" w:color="auto"/>
+          <w:left w:val="single" w:sz="2" w:space="0" w:color="auto"/>
+          <w:bottom w:val="single" w:sz="2" w:space="0" w:color="auto"/>
+          <w:right w:val="single" w:sz="2" w:space="0" w:color="auto"/>
+        </w:pBdr>
+        <w:shd w:val="clear" w:color="auto" w:fill="F8F8F8"/>
+        <w:spacing w:before="100" w:beforeAutospacing="1" w:after="100" w:afterAutospacing="1" w:line="240" w:lineRule="auto"/>
+        <w:rPr>
+          <w:rFonts w:ascii="Arial" w:eastAsia="Times New Roman" w:hAnsi="Arial" w:cs="Arial"/>
+          <w:color w:val="3B3B3B"/>
+          <w:kern w:val="0"/>
+          <w:sz w:val="20"/>
+          <w:szCs w:val="20"/>
+          <w14:ligatures w14:val="none"/>
+        </w:rPr>
+      </w:pPr>
+      <w:r>
+        <w:rPr>
+          <w:rFonts w:ascii="Arial" w:eastAsia="Times New Roman" w:hAnsi="Arial" w:cs="Arial"/>
+          <w:b/>
+          <w:bCs/>
+          <w:color w:val="3B3B3B"/>
+          <w:kern w:val="0"/>
+          <w:sz w:val="20"/>
+          <w:szCs w:val="20"/>
+          <w:bdr w:val="single" w:sz="2" w:space="0" w:color="auto" w:frame="1"/>
+          <w14:ligatures w14:val="none"/>
+        </w:rPr>
+        <w:t>Trigger Attack Wave</w:t>
+      </w:r>
+      <w:r>
+        <w:rPr>
+          <w:rFonts w:ascii="Arial" w:eastAsia="Times New Roman" w:hAnsi="Arial" w:cs="Arial"/>
+          <w:color w:val="3B3B3B"/>
+          <w:kern w:val="0"/>
+          <w:sz w:val="20"/>
+          <w:szCs w:val="20"/>
+          <w14:ligatures w14:val="none"/>
+        </w:rPr>
+        <w:t>: Clicking this initiates a simulated breach. The global posture score drops to </w:t>
+      </w:r>
+      <w:r>
+        <w:rPr>
+          <w:rFonts w:ascii="Menlo" w:eastAsia="Times New Roman" w:hAnsi="Menlo" w:cs="Menlo"/>
+          <w:color w:val="3B3B3B"/>
+          <w:kern w:val="0"/>
+          <w:sz w:val="18"/>
+          <w:szCs w:val="18"/>
+          <w:bdr w:val="single" w:sz="2" w:space="0" w:color="auto" w:frame="1"/>
+          <w14:ligatures w14:val="none"/>
+        </w:rPr>
+        <w:t>42</w:t>
+      </w:r>
+      <w:r>
+        <w:rPr>
+          <w:rFonts w:ascii="Arial" w:eastAsia="Times New Roman" w:hAnsi="Arial" w:cs="Arial"/>
+          <w:color w:val="3B3B3B"/>
+          <w:kern w:val="0"/>
+          <w:sz w:val="20"/>
+          <w:szCs w:val="20"/>
+          <w14:ligatures w14:val="none"/>
+        </w:rPr>
+        <w:t> (Critical Risk), GRC and MTTR HUD cards flash warning indicators, and the Unified SOC Terminal is flooded with critical logs representing failed checks, DDoS packet storms, and buffer overflows.</w:t>
+      </w:r>
+    </w:p>
+    <w:p>
+      <w:pPr>
+        <w:numPr>
+          <w:ilvl w:val="1"/>
+          <w:numId w:val="6"/>
+        </w:numPr>
+        <w:pBdr>
+          <w:top w:val="single" w:sz="2" w:space="0" w:color="auto"/>
+          <w:left w:val="single" w:sz="2" w:space="0" w:color="auto"/>
+          <w:bottom w:val="single" w:sz="2" w:space="0" w:color="auto"/>
+          <w:right w:val="single" w:sz="2" w:space="0" w:color="auto"/>
+        </w:pBdr>
+        <w:shd w:val="clear" w:color="auto" w:fill="F8F8F8"/>
+        <w:spacing w:before="100" w:beforeAutospacing="1" w:after="100" w:afterAutospacing="1" w:line="240" w:lineRule="auto"/>
+        <w:rPr>
+          <w:rFonts w:ascii="Arial" w:eastAsia="Times New Roman" w:hAnsi="Arial" w:cs="Arial"/>
+          <w:color w:val="3B3B3B"/>
+          <w:kern w:val="0"/>
+          <w:sz w:val="20"/>
+          <w:szCs w:val="20"/>
+          <w14:ligatures w14:val="none"/>
+        </w:rPr>
+      </w:pPr>
+      <w:r>
+        <w:rPr>
+          <w:rFonts w:ascii="Arial" w:eastAsia="Times New Roman" w:hAnsi="Arial" w:cs="Arial"/>
+          <w:b/>
+          <w:bCs/>
+          <w:color w:val="3B3B3B"/>
+          <w:kern w:val="0"/>
+          <w:sz w:val="20"/>
+          <w:szCs w:val="20"/>
+          <w:bdr w:val="single" w:sz="2" w:space="0" w:color="auto" w:frame="1"/>
+          <w14:ligatures w14:val="none"/>
+        </w:rPr>
+        <w:t>Run SOC Playbook</w:t>
+      </w:r>
+      <w:r>
+        <w:rPr>
+          <w:rFonts w:ascii="Arial" w:eastAsia="Times New Roman" w:hAnsi="Arial" w:cs="Arial"/>
+          <w:color w:val="3B3B3B"/>
+          <w:kern w:val="0"/>
+          <w:sz w:val="20"/>
+          <w:szCs w:val="20"/>
+          <w14:ligatures w14:val="none"/>
+        </w:rPr>
+        <w:t>: Clicking this initiates a multithreaded mitigation script, displaying an EDR/Firewall progress bar. It null-routes attacker IPs, stops crypto-miner PIDs, locks public AWS buckets, and sweeps all dashboard indices back to green (restoring the score to </w:t>
+      </w:r>
+      <w:r>
+        <w:rPr>
+          <w:rFonts w:ascii="Menlo" w:eastAsia="Times New Roman" w:hAnsi="Menlo" w:cs="Menlo"/>
+          <w:color w:val="3B3B3B"/>
+          <w:kern w:val="0"/>
+          <w:sz w:val="18"/>
+          <w:szCs w:val="18"/>
+          <w:bdr w:val="single" w:sz="2" w:space="0" w:color="auto" w:frame="1"/>
+          <w14:ligatures w14:val="none"/>
+        </w:rPr>
+        <w:t>98</w:t>
+      </w:r>
+      <w:r>
+        <w:rPr>
+          <w:rFonts w:ascii="Arial" w:eastAsia="Times New Roman" w:hAnsi="Arial" w:cs="Arial"/>
+          <w:color w:val="3B3B3B"/>
+          <w:kern w:val="0"/>
+          <w:sz w:val="20"/>
+          <w:szCs w:val="20"/>
+          <w14:ligatures w14:val="none"/>
+        </w:rPr>
+        <w:t>!).</w:t>
+      </w:r>
+    </w:p>
+    <w:p>
+      <w:pPr>
+        <w:numPr>
+          <w:ilvl w:val="0"/>
+          <w:numId w:val="6"/>
+        </w:numPr>
+        <w:pBdr>
+          <w:top w:val="single" w:sz="2" w:space="0" w:color="auto"/>
+          <w:left w:val="single" w:sz="2" w:space="0" w:color="auto"/>
+          <w:bottom w:val="single" w:sz="2" w:space="0" w:color="auto"/>
+          <w:right w:val="single" w:sz="2" w:space="0" w:color="auto"/>
+        </w:pBdr>
+        <w:shd w:val="clear" w:color="auto" w:fill="F8F8F8"/>
+        <w:spacing w:after="0" w:line="240" w:lineRule="auto"/>
+        <w:rPr>
+          <w:rFonts w:ascii="Arial" w:eastAsia="Times New Roman" w:hAnsi="Arial" w:cs="Arial"/>
+          <w:color w:val="3B3B3B"/>
+          <w:kern w:val="0"/>
+          <w:sz w:val="20"/>
+          <w:szCs w:val="20"/>
+          <w14:ligatures w14:val="none"/>
+        </w:rPr>
+      </w:pPr>
+      <w:r>
+        <w:rPr>
+          <w:rFonts w:ascii="Apple Color Emoji" w:eastAsia="Times New Roman" w:hAnsi="Apple Color Emoji" w:cs="Apple Color Emoji"/>
+          <w:b/>
+          <w:bCs/>
+          <w:color w:val="3B3B3B"/>
+          <w:kern w:val="0"/>
+          <w:sz w:val="20"/>
+          <w:szCs w:val="20"/>
+          <w:bdr w:val="single" w:sz="2" w:space="0" w:color="auto" w:frame="1"/>
+          <w14:ligatures w14:val="none"/>
+        </w:rPr>
+        <w:t>🖥️</w:t>
+      </w:r>
+      <w:r>
+        <w:rPr>
+          <w:rFonts w:ascii="Arial" w:eastAsia="Times New Roman" w:hAnsi="Arial" w:cs="Arial"/>
+          <w:b/>
+          <w:bCs/>
+          <w:color w:val="3B3B3B"/>
+          <w:kern w:val="0"/>
+          <w:sz w:val="20"/>
+          <w:szCs w:val="20"/>
+          <w:bdr w:val="single" w:sz="2" w:space="0" w:color="auto" w:frame="1"/>
+          <w14:ligatures w14:val="none"/>
+        </w:rPr>
+        <w:t xml:space="preserve"> Live Unified SOC Event Console Terminal</w:t>
+      </w:r>
+      <w:r>
+        <w:rPr>
+          <w:rFonts w:ascii="Arial" w:eastAsia="Times New Roman" w:hAnsi="Arial" w:cs="Arial"/>
+          <w:color w:val="3B3B3B"/>
+          <w:kern w:val="0"/>
+          <w:sz w:val="20"/>
+          <w:szCs w:val="20"/>
+          <w14:ligatures w14:val="none"/>
+        </w:rPr>
+        <w:t>:</w:t>
+      </w:r>
+    </w:p>
+    <w:p>
+      <w:pPr>
+        <w:numPr>
+          <w:ilvl w:val="1"/>
+          <w:numId w:val="6"/>
+        </w:numPr>
+        <w:pBdr>
+          <w:top w:val="single" w:sz="2" w:space="0" w:color="auto"/>
+          <w:left w:val="single" w:sz="2" w:space="0" w:color="auto"/>
+          <w:bottom w:val="single" w:sz="2" w:space="0" w:color="auto"/>
+          <w:right w:val="single" w:sz="2" w:space="0" w:color="auto"/>
+        </w:pBdr>
+        <w:shd w:val="clear" w:color="auto" w:fill="F8F8F8"/>
+        <w:spacing w:before="100" w:beforeAutospacing="1" w:after="100" w:afterAutospacing="1" w:line="240" w:lineRule="auto"/>
+        <w:rPr>
+          <w:rFonts w:ascii="Arial" w:eastAsia="Times New Roman" w:hAnsi="Arial" w:cs="Arial"/>
+          <w:color w:val="3B3B3B"/>
+          <w:kern w:val="0"/>
+          <w:sz w:val="20"/>
+          <w:szCs w:val="20"/>
+          <w14:ligatures w14:val="none"/>
+        </w:rPr>
+      </w:pPr>
+      <w:r>
+        <w:rPr>
+          <w:rFonts w:ascii="Arial" w:eastAsia="Times New Roman" w:hAnsi="Arial" w:cs="Arial"/>
+          <w:color w:val="3B3B3B"/>
+          <w:kern w:val="0"/>
+          <w:sz w:val="20"/>
+          <w:szCs w:val="20"/>
+          <w14:ligatures w14:val="none"/>
+        </w:rPr>
+        <w:t>Add a retro developer terminal console at the bottom of the overview page.</w:t>
+      </w:r>
+    </w:p>
+    <w:p>
+      <w:pPr>
+        <w:numPr>
+          <w:ilvl w:val="1"/>
+          <w:numId w:val="6"/>
+        </w:numPr>
+        <w:pBdr>
+          <w:top w:val="single" w:sz="2" w:space="0" w:color="auto"/>
+          <w:left w:val="single" w:sz="2" w:space="0" w:color="auto"/>
+          <w:bottom w:val="single" w:sz="2" w:space="0" w:color="auto"/>
+          <w:right w:val="single" w:sz="2" w:space="0" w:color="auto"/>
+        </w:pBdr>
+        <w:shd w:val="clear" w:color="auto" w:fill="F8F8F8"/>
+        <w:spacing w:before="100" w:beforeAutospacing="1" w:after="100" w:afterAutospacing="1" w:line="240" w:lineRule="auto"/>
+        <w:rPr>
+          <w:rFonts w:ascii="Arial" w:eastAsia="Times New Roman" w:hAnsi="Arial" w:cs="Arial"/>
+          <w:color w:val="3B3B3B"/>
+          <w:kern w:val="0"/>
+          <w:sz w:val="20"/>
+          <w:szCs w:val="20"/>
+          <w14:ligatures w14:val="none"/>
+        </w:rPr>
+      </w:pPr>
+      <w:r>
+        <w:rPr>
+          <w:rFonts w:ascii="Arial" w:eastAsia="Times New Roman" w:hAnsi="Arial" w:cs="Arial"/>
+          <w:color w:val="3B3B3B"/>
+          <w:kern w:val="0"/>
+          <w:sz w:val="20"/>
+          <w:szCs w:val="20"/>
+          <w14:ligatures w14:val="none"/>
+        </w:rPr>
+        <w:t>Streams aggregate real-time logs from Network, Cloud, EDR, AI Risk, and GRC modules.</w:t>
+      </w:r>
+    </w:p>
+    <w:p>
+      <w:pPr>
+        <w:numPr>
+          <w:ilvl w:val="1"/>
+          <w:numId w:val="6"/>
+        </w:numPr>
+        <w:pBdr>
+          <w:top w:val="single" w:sz="2" w:space="0" w:color="auto"/>
+          <w:left w:val="single" w:sz="2" w:space="0" w:color="auto"/>
+          <w:bottom w:val="single" w:sz="2" w:space="0" w:color="auto"/>
+          <w:right w:val="single" w:sz="2" w:space="0" w:color="auto"/>
+        </w:pBdr>
+        <w:shd w:val="clear" w:color="auto" w:fill="F8F8F8"/>
+        <w:spacing w:before="100" w:beforeAutospacing="1" w:after="100" w:afterAutospacing="1" w:line="240" w:lineRule="auto"/>
+        <w:rPr>
+          <w:rFonts w:ascii="Arial" w:eastAsia="Times New Roman" w:hAnsi="Arial" w:cs="Arial"/>
+          <w:color w:val="3B3B3B"/>
+          <w:kern w:val="0"/>
+          <w:sz w:val="20"/>
+          <w:szCs w:val="20"/>
+          <w14:ligatures w14:val="none"/>
+        </w:rPr>
+      </w:pPr>
+      <w:r>
+        <w:rPr>
+          <w:rFonts w:ascii="Arial" w:eastAsia="Times New Roman" w:hAnsi="Arial" w:cs="Arial"/>
+          <w:color w:val="3B3B3B"/>
+          <w:kern w:val="0"/>
+          <w:sz w:val="20"/>
+          <w:szCs w:val="20"/>
+          <w14:ligatures w14:val="none"/>
+        </w:rPr>
+        <w:t>Interactive filters (All, Cloud, Network, Server, AI, Compliance) isolate logs from specific layers instantly.</w:t>
+      </w:r>
+    </w:p>
+    <w:p>
+      <w:pPr>
+        <w:numPr>
+          <w:ilvl w:val="0"/>
+          <w:numId w:val="6"/>
+        </w:numPr>
+        <w:pBdr>
+          <w:top w:val="single" w:sz="2" w:space="0" w:color="auto"/>
+          <w:left w:val="single" w:sz="2" w:space="0" w:color="auto"/>
+          <w:bottom w:val="single" w:sz="2" w:space="0" w:color="auto"/>
+          <w:right w:val="single" w:sz="2" w:space="0" w:color="auto"/>
+        </w:pBdr>
+        <w:shd w:val="clear" w:color="auto" w:fill="F8F8F8"/>
+        <w:spacing w:after="0" w:line="240" w:lineRule="auto"/>
+        <w:rPr>
+          <w:rFonts w:ascii="Arial" w:eastAsia="Times New Roman" w:hAnsi="Arial" w:cs="Arial"/>
+          <w:color w:val="3B3B3B"/>
+          <w:kern w:val="0"/>
+          <w:sz w:val="20"/>
+          <w:szCs w:val="20"/>
+          <w14:ligatures w14:val="none"/>
+        </w:rPr>
+      </w:pPr>
+      <w:r>
+        <w:rPr>
+          <w:rFonts w:ascii="Apple Color Emoji" w:eastAsia="Times New Roman" w:hAnsi="Apple Color Emoji" w:cs="Apple Color Emoji"/>
+          <w:b/>
+          <w:bCs/>
+          <w:color w:val="3B3B3B"/>
+          <w:kern w:val="0"/>
+          <w:sz w:val="20"/>
+          <w:szCs w:val="20"/>
+          <w:bdr w:val="single" w:sz="2" w:space="0" w:color="auto" w:frame="1"/>
+          <w14:ligatures w14:val="none"/>
+        </w:rPr>
+        <w:t>🎨</w:t>
+      </w:r>
+      <w:r>
+        <w:rPr>
+          <w:rFonts w:ascii="Arial" w:eastAsia="Times New Roman" w:hAnsi="Arial" w:cs="Arial"/>
+          <w:b/>
+          <w:bCs/>
+          <w:color w:val="3B3B3B"/>
+          <w:kern w:val="0"/>
+          <w:sz w:val="20"/>
+          <w:szCs w:val="20"/>
+          <w:bdr w:val="single" w:sz="2" w:space="0" w:color="auto" w:frame="1"/>
+          <w14:ligatures w14:val="none"/>
+        </w:rPr>
+        <w:t xml:space="preserve"> Glassmorphism &amp; Visual Polish</w:t>
+      </w:r>
+      <w:r>
+        <w:rPr>
+          <w:rFonts w:ascii="Arial" w:eastAsia="Times New Roman" w:hAnsi="Arial" w:cs="Arial"/>
+          <w:color w:val="3B3B3B"/>
+          <w:kern w:val="0"/>
+          <w:sz w:val="20"/>
+          <w:szCs w:val="20"/>
+          <w14:ligatures w14:val="none"/>
+        </w:rPr>
+        <w:t>:</w:t>
+      </w:r>
+    </w:p>
+    <w:p>
+      <w:pPr>
+        <w:numPr>
+          <w:ilvl w:val="1"/>
+          <w:numId w:val="6"/>
+        </w:numPr>
+        <w:pBdr>
+          <w:top w:val="single" w:sz="2" w:space="0" w:color="auto"/>
+          <w:left w:val="single" w:sz="2" w:space="0" w:color="auto"/>
+          <w:bottom w:val="single" w:sz="2" w:space="0" w:color="auto"/>
+          <w:right w:val="single" w:sz="2" w:space="0" w:color="auto"/>
+        </w:pBdr>
+        <w:shd w:val="clear" w:color="auto" w:fill="F8F8F8"/>
+        <w:spacing w:before="100" w:beforeAutospacing="1" w:after="100" w:afterAutospacing="1" w:line="240" w:lineRule="auto"/>
+        <w:rPr>
+          <w:rFonts w:ascii="Arial" w:eastAsia="Times New Roman" w:hAnsi="Arial" w:cs="Arial"/>
+          <w:color w:val="3B3B3B"/>
+          <w:kern w:val="0"/>
+          <w:sz w:val="20"/>
+          <w:szCs w:val="20"/>
+          <w14:ligatures w14:val="none"/>
+        </w:rPr>
+      </w:pPr>
+      <w:r>
+        <w:rPr>
+          <w:rFonts w:ascii="Arial" w:eastAsia="Times New Roman" w:hAnsi="Arial" w:cs="Arial"/>
+          <w:color w:val="3B3B3B"/>
+          <w:kern w:val="0"/>
+          <w:sz w:val="20"/>
+          <w:szCs w:val="20"/>
+          <w14:ligatures w14:val="none"/>
+        </w:rPr>
+        <w:t>Refactored layouts with premium CSS borders, subtle HSL glows, and transition animations.</w:t>
+      </w:r>
+    </w:p>
+    <w:p>
+      <w:pPr>
+        <w:numPr>
+          <w:ilvl w:val="1"/>
+          <w:numId w:val="6"/>
+        </w:numPr>
+        <w:pBdr>
+          <w:top w:val="single" w:sz="2" w:space="0" w:color="auto"/>
+          <w:left w:val="single" w:sz="2" w:space="0" w:color="auto"/>
+          <w:bottom w:val="single" w:sz="2" w:space="0" w:color="auto"/>
+          <w:right w:val="single" w:sz="2" w:space="0" w:color="auto"/>
+        </w:pBdr>
+        <w:shd w:val="clear" w:color="auto" w:fill="F8F8F8"/>
+        <w:spacing w:before="100" w:beforeAutospacing="1" w:after="100" w:afterAutospacing="1" w:line="240" w:lineRule="auto"/>
+        <w:rPr>
+          <w:rFonts w:ascii="Arial" w:eastAsia="Times New Roman" w:hAnsi="Arial" w:cs="Arial"/>
+          <w:color w:val="3B3B3B"/>
+          <w:kern w:val="0"/>
+          <w:sz w:val="20"/>
+          <w:szCs w:val="20"/>
+          <w14:ligatures w14:val="none"/>
+        </w:rPr>
+      </w:pPr>
+      <w:r>
+        <w:rPr>
+          <w:rFonts w:ascii="Arial" w:eastAsia="Times New Roman" w:hAnsi="Arial" w:cs="Arial"/>
+          <w:color w:val="3B3B3B"/>
+          <w:kern w:val="0"/>
+          <w:sz w:val="20"/>
+          <w:szCs w:val="20"/>
+          <w14:ligatures w14:val="none"/>
+        </w:rPr>
+        <w:t>The 10 security control cards scale up on hover and feature active progress indicators that update dynamically based on simulator states.</w:t>
+      </w:r>
+    </w:p>
+    <w:p>
+      <w:pPr>
+        <w:pBdr>
+          <w:top w:val="single" w:sz="2" w:space="0" w:color="auto"/>
+          <w:left w:val="single" w:sz="2" w:space="0" w:color="auto"/>
+          <w:bottom w:val="single" w:sz="2" w:space="0" w:color="auto"/>
+          <w:right w:val="single" w:sz="2" w:space="0" w:color="auto"/>
+        </w:pBdr>
+        <w:shd w:val="clear" w:color="auto" w:fill="F8F8F8"/>
+        <w:spacing w:before="100" w:beforeAutospacing="1" w:after="100" w:afterAutospacing="1" w:line="240" w:lineRule="auto"/>
+        <w:outlineLvl w:val="2"/>
+        <w:rPr>
+          <w:rFonts w:ascii="Arial" w:eastAsia="Times New Roman" w:hAnsi="Arial" w:cs="Arial"/>
+          <w:color w:val="3B3B3B"/>
+          <w:kern w:val="0"/>
+          <w:sz w:val="27"/>
+          <w:szCs w:val="27"/>
+          <w14:ligatures w14:val="none"/>
+        </w:rPr>
+      </w:pPr>
+      <w:r>
+        <w:rPr>
+          <w:rFonts w:ascii="Arial" w:eastAsia="Times New Roman" w:hAnsi="Arial" w:cs="Arial"/>
+          <w:color w:val="3B3B3B"/>
+          <w:kern w:val="0"/>
+          <w:sz w:val="27"/>
+          <w:szCs w:val="27"/>
+          <w14:ligatures w14:val="none"/>
+        </w:rPr>
+        <w:t>Project Verification:</w:t>
+      </w:r>
+    </w:p>
+    <w:p>
+      <w:pPr>
+        <w:numPr>
+          <w:ilvl w:val="0"/>
+          <w:numId w:val="7"/>
+        </w:numPr>
+        <w:pBdr>
+          <w:top w:val="single" w:sz="2" w:space="0" w:color="auto"/>
+          <w:left w:val="single" w:sz="2" w:space="0" w:color="auto"/>
+          <w:bottom w:val="single" w:sz="2" w:space="0" w:color="auto"/>
+          <w:right w:val="single" w:sz="2" w:space="0" w:color="auto"/>
+        </w:pBdr>
+        <w:shd w:val="clear" w:color="auto" w:fill="F8F8F8"/>
+        <w:spacing w:before="100" w:beforeAutospacing="1" w:after="100" w:afterAutospacing="1" w:line="240" w:lineRule="auto"/>
+        <w:rPr>
+          <w:rFonts w:ascii="Arial" w:eastAsia="Times New Roman" w:hAnsi="Arial" w:cs="Arial"/>
+          <w:color w:val="3B3B3B"/>
+          <w:kern w:val="0"/>
+          <w:sz w:val="20"/>
+          <w:szCs w:val="20"/>
+          <w14:ligatures w14:val="none"/>
+        </w:rPr>
+      </w:pPr>
+      <w:r>
+        <w:rPr>
+          <w:rFonts w:ascii="Arial" w:eastAsia="Times New Roman" w:hAnsi="Arial" w:cs="Arial"/>
+          <w:color w:val="3B3B3B"/>
+          <w:kern w:val="0"/>
+          <w:sz w:val="20"/>
+          <w:szCs w:val="20"/>
+          <w14:ligatures w14:val="none"/>
+        </w:rPr>
+        <w:t>Verified that the production build compiles under Next.js Turbopack compiler without any compilation, type, or linting anomalies.</w:t>
+      </w:r>
+    </w:p>
+    <w:p>
+      <w:pPr>
+        <w:numPr>
+          <w:ilvl w:val="0"/>
+          <w:numId w:val="7"/>
+        </w:numPr>
+        <w:pBdr>
+          <w:top w:val="single" w:sz="2" w:space="0" w:color="auto"/>
+          <w:left w:val="single" w:sz="2" w:space="0" w:color="auto"/>
+          <w:bottom w:val="single" w:sz="2" w:space="0" w:color="auto"/>
+          <w:right w:val="single" w:sz="2" w:space="0" w:color="auto"/>
+        </w:pBdr>
+        <w:shd w:val="clear" w:color="auto" w:fill="F8F8F8"/>
+        <w:spacing w:before="100" w:beforeAutospacing="1" w:after="100" w:afterAutospacing="1" w:line="240" w:lineRule="auto"/>
+        <w:rPr>
+          <w:rFonts w:ascii="Arial" w:eastAsia="Times New Roman" w:hAnsi="Arial" w:cs="Arial"/>
+          <w:color w:val="3B3B3B"/>
+          <w:kern w:val="0"/>
+          <w:sz w:val="20"/>
+          <w:szCs w:val="20"/>
+          <w14:ligatures w14:val="none"/>
+        </w:rPr>
+      </w:pPr>
+      <w:r>
+        <w:rPr>
+          <w:rFonts w:ascii="Arial" w:eastAsia="Times New Roman" w:hAnsi="Arial" w:cs="Arial"/>
+          <w:color w:val="3B3B3B"/>
+          <w:kern w:val="0"/>
+          <w:sz w:val="20"/>
+          <w:szCs w:val="20"/>
+          <w14:ligatures w14:val="none"/>
+        </w:rPr>
+        <w:t>Upgraded the tracking checklists </w:t>
+      </w:r>
+      <w:r>
+        <w:rPr>
+          <w:rFonts w:ascii="Arial" w:eastAsia="Times New Roman" w:hAnsi="Arial" w:cs="Arial"/>
+          <w:color w:val="3B3B3B"/>
+          <w:kern w:val="0"/>
+          <w:sz w:val="20"/>
+          <w:szCs w:val="20"/>
+          <w:bdr w:val="single" w:sz="2" w:space="0" w:color="auto" w:frame="1"/>
+          <w14:ligatures w14:val="none"/>
+        </w:rPr>
+        <w:t>task.md</w:t>
+      </w:r>
+      <w:r>
+        <w:rPr>
+          <w:rFonts w:ascii="Arial" w:eastAsia="Times New Roman" w:hAnsi="Arial" w:cs="Arial"/>
+          <w:color w:val="3B3B3B"/>
+          <w:kern w:val="0"/>
+          <w:sz w:val="20"/>
+          <w:szCs w:val="20"/>
+          <w14:ligatures w14:val="none"/>
+        </w:rPr>
+        <w:t> and descriptive presentation log </w:t>
+      </w:r>
+      <w:r>
+        <w:rPr>
+          <w:rFonts w:ascii="Arial" w:eastAsia="Times New Roman" w:hAnsi="Arial" w:cs="Arial"/>
+          <w:color w:val="3B3B3B"/>
+          <w:kern w:val="0"/>
+          <w:sz w:val="20"/>
+          <w:szCs w:val="20"/>
+          <w:bdr w:val="single" w:sz="2" w:space="0" w:color="auto" w:frame="1"/>
+          <w14:ligatures w14:val="none"/>
+        </w:rPr>
+        <w:t>walkthrough.md</w:t>
+      </w:r>
+      <w:r>
+        <w:rPr>
+          <w:rFonts w:ascii="Arial" w:eastAsia="Times New Roman" w:hAnsi="Arial" w:cs="Arial"/>
+          <w:color w:val="3B3B3B"/>
+          <w:kern w:val="0"/>
+          <w:sz w:val="20"/>
+          <w:szCs w:val="20"/>
+          <w14:ligatures w14:val="none"/>
+        </w:rPr>
+        <w:t>.</w:t>
+      </w:r>
+    </w:p>
+    <w:p>
+      <w:pPr>
+        <w:numPr>
+          <w:ilvl w:val="0"/>
+          <w:numId w:val="7"/>
+        </w:numPr>
+        <w:pBdr>
+          <w:top w:val="single" w:sz="2" w:space="0" w:color="auto"/>
+          <w:left w:val="single" w:sz="2" w:space="0" w:color="auto"/>
+          <w:bottom w:val="single" w:sz="2" w:space="0" w:color="auto"/>
+          <w:right w:val="single" w:sz="2" w:space="0" w:color="auto"/>
+        </w:pBdr>
+        <w:shd w:val="clear" w:color="auto" w:fill="F8F8F8"/>
+        <w:spacing w:before="100" w:beforeAutospacing="1" w:after="100" w:afterAutospacing="1" w:line="240" w:lineRule="auto"/>
+        <w:rPr>
+          <w:rFonts w:ascii="Arial" w:eastAsia="Times New Roman" w:hAnsi="Arial" w:cs="Arial"/>
+          <w:color w:val="3B3B3B"/>
+          <w:kern w:val="0"/>
+          <w:sz w:val="20"/>
+          <w:szCs w:val="20"/>
+          <w14:ligatures w14:val="none"/>
+        </w:rPr>
+      </w:pPr>
+      <w:r>
+        <w:rPr>
+          <w:rFonts w:ascii="Arial" w:eastAsia="Times New Roman" w:hAnsi="Arial" w:cs="Arial"/>
+          <w:color w:val="3B3B3B"/>
+          <w:kern w:val="0"/>
+          <w:sz w:val="20"/>
+          <w:szCs w:val="20"/>
+          <w14:ligatures w14:val="none"/>
+        </w:rPr>
+        <w:t>Committed changes and pushed to remote </w:t>
+      </w:r>
+      <w:r>
+        <w:rPr>
+          <w:rFonts w:ascii="Menlo" w:eastAsia="Times New Roman" w:hAnsi="Menlo" w:cs="Menlo"/>
+          <w:color w:val="3B3B3B"/>
+          <w:kern w:val="0"/>
+          <w:sz w:val="18"/>
+          <w:szCs w:val="18"/>
+          <w:bdr w:val="single" w:sz="2" w:space="0" w:color="auto" w:frame="1"/>
+          <w14:ligatures w14:val="none"/>
+        </w:rPr>
+        <w:t>main</w:t>
+      </w:r>
+      <w:r>
+        <w:rPr>
+          <w:rFonts w:ascii="Arial" w:eastAsia="Times New Roman" w:hAnsi="Arial" w:cs="Arial"/>
+          <w:color w:val="3B3B3B"/>
+          <w:kern w:val="0"/>
+          <w:sz w:val="20"/>
+          <w:szCs w:val="20"/>
+          <w14:ligatures w14:val="none"/>
+        </w:rPr>
+        <w:t>, deploying live on </w:t>
+      </w:r>
+      <w:r>
+        <w:rPr>
+          <w:rFonts w:ascii="Menlo" w:eastAsia="Times New Roman" w:hAnsi="Menlo" w:cs="Menlo"/>
+          <w:b/>
+          <w:bCs/>
+          <w:color w:val="3B3B3B"/>
+          <w:kern w:val="0"/>
+          <w:sz w:val="18"/>
+          <w:szCs w:val="18"/>
+          <w:bdr w:val="single" w:sz="2" w:space="0" w:color="auto" w:frame="1"/>
+          <w14:ligatures w14:val="none"/>
+        </w:rPr>
+        <w:t>https://posturepilot.io</w:t>
+      </w:r>
+      <w:r>
+        <w:rPr>
+          <w:rFonts w:ascii="Arial" w:eastAsia="Times New Roman" w:hAnsi="Arial" w:cs="Arial"/>
+          <w:color w:val="3B3B3B"/>
+          <w:kern w:val="0"/>
+          <w:sz w:val="20"/>
+          <w:szCs w:val="20"/>
+          <w14:ligatures w14:val="none"/>
+        </w:rPr>
+        <w:t>.</w:t>
+      </w:r>
+    </w:p>
+    <w:p>
+      <w:pPr>
+        <w:pBdr>
+          <w:top w:val="single" w:sz="2" w:space="0" w:color="auto"/>
+          <w:left w:val="single" w:sz="2" w:space="0" w:color="auto"/>
+          <w:bottom w:val="single" w:sz="2" w:space="0" w:color="auto"/>
+          <w:right w:val="single" w:sz="2" w:space="0" w:color="auto"/>
+        </w:pBdr>
+        <w:shd w:val="clear" w:color="auto" w:fill="F8F8F8"/>
+        <w:spacing w:after="0" w:line="240" w:lineRule="auto"/>
+        <w:rPr>
+          <w:rFonts w:ascii="Arial" w:eastAsia="Times New Roman" w:hAnsi="Arial" w:cs="Arial"/>
+          <w:color w:val="3B3B3B"/>
+          <w:kern w:val="0"/>
+          <w:sz w:val="20"/>
+          <w:szCs w:val="20"/>
+          <w14:ligatures w14:val="none"/>
+        </w:rPr>
+      </w:pPr>
+      <w:r>
+        <w:rPr>
+          <w:rFonts w:ascii="Arial" w:eastAsia="Times New Roman" w:hAnsi="Arial" w:cs="Arial"/>
+          <w:color w:val="3B3B3B"/>
+          <w:kern w:val="0"/>
+          <w:sz w:val="20"/>
+          <w:szCs w:val="20"/>
+          <w14:ligatures w14:val="none"/>
+        </w:rPr>
+        <w:t>You can refresh the live URL (or restart your local dev server) to test these updates. Let me know if you would like any minor adjustments!</w:t>
+      </w:r>
+    </w:p>
+    <w:p/>
+    <w:p>
+      <w:pPr>
+        <w:pBdr>
+          <w:top w:val="single" w:sz="2" w:space="0" w:color="auto"/>
+          <w:left w:val="single" w:sz="2" w:space="0" w:color="auto"/>
+          <w:bottom w:val="single" w:sz="2" w:space="0" w:color="auto"/>
+          <w:right w:val="single" w:sz="2" w:space="0" w:color="auto"/>
+        </w:pBdr>
+        <w:shd w:val="clear" w:color="auto" w:fill="F8F8F8"/>
+        <w:spacing w:after="0" w:line="240" w:lineRule="auto"/>
+        <w:rPr>
+          <w:rFonts w:ascii="Arial" w:eastAsia="Times New Roman" w:hAnsi="Arial" w:cs="Arial"/>
+          <w:color w:val="3B3B3B"/>
+          <w:kern w:val="0"/>
+          <w:sz w:val="20"/>
+          <w:szCs w:val="20"/>
+          <w14:ligatures w14:val="none"/>
+        </w:rPr>
+      </w:pPr>
+      <w:r>
+        <w:rPr>
+          <w:rFonts w:ascii="Arial" w:eastAsia="Times New Roman" w:hAnsi="Arial" w:cs="Arial"/>
+          <w:color w:val="3B3B3B"/>
+          <w:kern w:val="0"/>
+          <w:sz w:val="20"/>
+          <w:szCs w:val="20"/>
+          <w14:ligatures w14:val="none"/>
+        </w:rPr>
+        <w:t>I have created a comprehensive </w:t>
+      </w:r>
+      <w:r>
+        <w:rPr>
+          <w:rFonts w:ascii="Arial" w:eastAsia="Times New Roman" w:hAnsi="Arial" w:cs="Arial"/>
+          <w:b/>
+          <w:bCs/>
+          <w:color w:val="3B3B3B"/>
+          <w:kern w:val="0"/>
+          <w:sz w:val="20"/>
+          <w:szCs w:val="20"/>
+          <w:bdr w:val="single" w:sz="2" w:space="0" w:color="auto" w:frame="1"/>
+          <w14:ligatures w14:val="none"/>
+        </w:rPr>
+        <w:t>Technical Implementation Plan</w:t>
+      </w:r>
+      <w:r>
+        <w:rPr>
+          <w:rFonts w:ascii="Arial" w:eastAsia="Times New Roman" w:hAnsi="Arial" w:cs="Arial"/>
+          <w:color w:val="3B3B3B"/>
+          <w:kern w:val="0"/>
+          <w:sz w:val="20"/>
+          <w:szCs w:val="20"/>
+          <w14:ligatures w14:val="none"/>
+        </w:rPr>
+        <w:t> to address your feedback!</w:t>
+      </w:r>
+    </w:p>
+    <w:p>
+      <w:pPr>
+        <w:pBdr>
+          <w:top w:val="single" w:sz="2" w:space="0" w:color="auto"/>
+          <w:left w:val="single" w:sz="2" w:space="0" w:color="auto"/>
+          <w:bottom w:val="single" w:sz="2" w:space="0" w:color="auto"/>
+          <w:right w:val="single" w:sz="2" w:space="0" w:color="auto"/>
+        </w:pBdr>
+        <w:shd w:val="clear" w:color="auto" w:fill="F8F8F8"/>
+        <w:spacing w:after="0" w:line="240" w:lineRule="auto"/>
+        <w:rPr>
+          <w:rFonts w:ascii="Arial" w:eastAsia="Times New Roman" w:hAnsi="Arial" w:cs="Arial"/>
+          <w:color w:val="3B3B3B"/>
+          <w:kern w:val="0"/>
+          <w:sz w:val="20"/>
+          <w:szCs w:val="20"/>
+          <w14:ligatures w14:val="none"/>
+        </w:rPr>
+      </w:pPr>
+      <w:r>
+        <w:rPr>
+          <w:rFonts w:ascii="Arial" w:eastAsia="Times New Roman" w:hAnsi="Arial" w:cs="Arial"/>
+          <w:color w:val="3B3B3B"/>
+          <w:kern w:val="0"/>
+          <w:sz w:val="20"/>
+          <w:szCs w:val="20"/>
+          <w14:ligatures w14:val="none"/>
+        </w:rPr>
+        <w:lastRenderedPageBreak/>
+        <w:t>As you highlighted, the premium </w:t>
+      </w:r>
+      <w:r>
+        <w:rPr>
+          <w:rFonts w:ascii="Arial" w:eastAsia="Times New Roman" w:hAnsi="Arial" w:cs="Arial"/>
+          <w:b/>
+          <w:bCs/>
+          <w:color w:val="3B3B3B"/>
+          <w:kern w:val="0"/>
+          <w:sz w:val="20"/>
+          <w:szCs w:val="20"/>
+          <w:bdr w:val="single" w:sz="2" w:space="0" w:color="auto" w:frame="1"/>
+          <w14:ligatures w14:val="none"/>
+        </w:rPr>
+        <w:t>Triple-Filter Triage (Secure)</w:t>
+      </w:r>
+      <w:r>
+        <w:rPr>
+          <w:rFonts w:ascii="Arial" w:eastAsia="Times New Roman" w:hAnsi="Arial" w:cs="Arial"/>
+          <w:color w:val="3B3B3B"/>
+          <w:kern w:val="0"/>
+          <w:sz w:val="20"/>
+          <w:szCs w:val="20"/>
+          <w14:ligatures w14:val="none"/>
+        </w:rPr>
+        <w:t> features showcased in the homepage mockups (Severity Gates, Exploitability Filters, Asset Criticality prioritization, and the 6 dynamic KPI cards) should be fully accessible inside the dashboard portal.</w:t>
+      </w:r>
+    </w:p>
+    <w:p>
+      <w:pPr>
+        <w:pBdr>
+          <w:top w:val="single" w:sz="2" w:space="0" w:color="auto"/>
+          <w:left w:val="single" w:sz="2" w:space="0" w:color="auto"/>
+          <w:bottom w:val="single" w:sz="2" w:space="0" w:color="auto"/>
+          <w:right w:val="single" w:sz="2" w:space="0" w:color="auto"/>
+        </w:pBdr>
+        <w:shd w:val="clear" w:color="auto" w:fill="F8F8F8"/>
+        <w:spacing w:after="0" w:line="240" w:lineRule="auto"/>
+        <w:rPr>
+          <w:rFonts w:ascii="Arial" w:eastAsia="Times New Roman" w:hAnsi="Arial" w:cs="Arial"/>
+          <w:color w:val="3B3B3B"/>
+          <w:kern w:val="0"/>
+          <w:sz w:val="20"/>
+          <w:szCs w:val="20"/>
+          <w14:ligatures w14:val="none"/>
+        </w:rPr>
+      </w:pPr>
+      <w:r>
+        <w:rPr>
+          <w:rFonts w:ascii="Arial" w:eastAsia="Times New Roman" w:hAnsi="Arial" w:cs="Arial"/>
+          <w:color w:val="3B3B3B"/>
+          <w:kern w:val="0"/>
+          <w:sz w:val="20"/>
+          <w:szCs w:val="20"/>
+          <w14:ligatures w14:val="none"/>
+        </w:rPr>
+        <w:t>I will deliver a dedicated, highly interactive </w:t>
+      </w:r>
+      <w:r>
+        <w:rPr>
+          <w:rFonts w:ascii="Arial" w:eastAsia="Times New Roman" w:hAnsi="Arial" w:cs="Arial"/>
+          <w:b/>
+          <w:bCs/>
+          <w:color w:val="3B3B3B"/>
+          <w:kern w:val="0"/>
+          <w:sz w:val="20"/>
+          <w:szCs w:val="20"/>
+          <w:bdr w:val="single" w:sz="2" w:space="0" w:color="auto" w:frame="1"/>
+          <w14:ligatures w14:val="none"/>
+        </w:rPr>
+        <w:t>"Secure / Triple-Filter Triage" Dashboard</w:t>
+      </w:r>
+      <w:r>
+        <w:rPr>
+          <w:rFonts w:ascii="Arial" w:eastAsia="Times New Roman" w:hAnsi="Arial" w:cs="Arial"/>
+          <w:color w:val="3B3B3B"/>
+          <w:kern w:val="0"/>
+          <w:sz w:val="20"/>
+          <w:szCs w:val="20"/>
+          <w14:ligatures w14:val="none"/>
+        </w:rPr>
+        <w:t> at </w:t>
+      </w:r>
+      <w:r>
+        <w:rPr>
+          <w:rFonts w:ascii="Menlo" w:eastAsia="Times New Roman" w:hAnsi="Menlo" w:cs="Menlo"/>
+          <w:color w:val="3B3B3B"/>
+          <w:kern w:val="0"/>
+          <w:sz w:val="18"/>
+          <w:szCs w:val="18"/>
+          <w:bdr w:val="single" w:sz="2" w:space="0" w:color="auto" w:frame="1"/>
+          <w14:ligatures w14:val="none"/>
+        </w:rPr>
+        <w:t>/dashboard/secure</w:t>
+      </w:r>
+      <w:r>
+        <w:rPr>
+          <w:rFonts w:ascii="Arial" w:eastAsia="Times New Roman" w:hAnsi="Arial" w:cs="Arial"/>
+          <w:color w:val="3B3B3B"/>
+          <w:kern w:val="0"/>
+          <w:sz w:val="20"/>
+          <w:szCs w:val="20"/>
+          <w14:ligatures w14:val="none"/>
+        </w:rPr>
+        <w:t> and register it inside our global sidebar navigation.</w:t>
+      </w:r>
+    </w:p>
+    <w:p>
+      <w:pPr>
+        <w:pBdr>
+          <w:top w:val="single" w:sz="2" w:space="0" w:color="auto"/>
+          <w:left w:val="single" w:sz="2" w:space="0" w:color="auto"/>
+          <w:bottom w:val="single" w:sz="2" w:space="0" w:color="auto"/>
+          <w:right w:val="single" w:sz="2" w:space="0" w:color="auto"/>
+        </w:pBdr>
+        <w:shd w:val="clear" w:color="auto" w:fill="F8F8F8"/>
+        <w:spacing w:before="100" w:beforeAutospacing="1" w:after="100" w:afterAutospacing="1" w:line="240" w:lineRule="auto"/>
+        <w:outlineLvl w:val="2"/>
+        <w:rPr>
+          <w:rFonts w:ascii="Arial" w:eastAsia="Times New Roman" w:hAnsi="Arial" w:cs="Arial"/>
+          <w:color w:val="3B3B3B"/>
+          <w:kern w:val="0"/>
+          <w:sz w:val="27"/>
+          <w:szCs w:val="27"/>
+          <w14:ligatures w14:val="none"/>
+        </w:rPr>
+      </w:pPr>
+      <w:r>
+        <w:rPr>
+          <w:rFonts w:ascii="Apple Color Emoji" w:eastAsia="Times New Roman" w:hAnsi="Apple Color Emoji" w:cs="Apple Color Emoji"/>
+          <w:color w:val="3B3B3B"/>
+          <w:kern w:val="0"/>
+          <w:sz w:val="27"/>
+          <w:szCs w:val="27"/>
+          <w14:ligatures w14:val="none"/>
+        </w:rPr>
+        <w:t>📋</w:t>
+      </w:r>
+      <w:r>
+        <w:rPr>
+          <w:rFonts w:ascii="Arial" w:eastAsia="Times New Roman" w:hAnsi="Arial" w:cs="Arial"/>
+          <w:color w:val="3B3B3B"/>
+          <w:kern w:val="0"/>
+          <w:sz w:val="27"/>
+          <w:szCs w:val="27"/>
+          <w14:ligatures w14:val="none"/>
+        </w:rPr>
+        <w:t xml:space="preserve"> Interactive Features Planned</w:t>
+      </w:r>
+    </w:p>
+    <w:p>
+      <w:pPr>
+        <w:numPr>
+          <w:ilvl w:val="0"/>
+          <w:numId w:val="8"/>
+        </w:numPr>
+        <w:pBdr>
+          <w:top w:val="single" w:sz="2" w:space="0" w:color="auto"/>
+          <w:left w:val="single" w:sz="2" w:space="0" w:color="auto"/>
+          <w:bottom w:val="single" w:sz="2" w:space="0" w:color="auto"/>
+          <w:right w:val="single" w:sz="2" w:space="0" w:color="auto"/>
+        </w:pBdr>
+        <w:shd w:val="clear" w:color="auto" w:fill="F8F8F8"/>
+        <w:spacing w:before="100" w:beforeAutospacing="1" w:after="100" w:afterAutospacing="1" w:line="240" w:lineRule="auto"/>
+        <w:rPr>
+          <w:rFonts w:ascii="Arial" w:eastAsia="Times New Roman" w:hAnsi="Arial" w:cs="Arial"/>
+          <w:color w:val="3B3B3B"/>
+          <w:kern w:val="0"/>
+          <w:sz w:val="20"/>
+          <w:szCs w:val="20"/>
+          <w14:ligatures w14:val="none"/>
+        </w:rPr>
+      </w:pPr>
+      <w:r>
+        <w:rPr>
+          <w:rFonts w:ascii="Apple Color Emoji" w:eastAsia="Times New Roman" w:hAnsi="Apple Color Emoji" w:cs="Apple Color Emoji"/>
+          <w:b/>
+          <w:bCs/>
+          <w:color w:val="3B3B3B"/>
+          <w:kern w:val="0"/>
+          <w:sz w:val="20"/>
+          <w:szCs w:val="20"/>
+          <w:bdr w:val="single" w:sz="2" w:space="0" w:color="auto" w:frame="1"/>
+          <w14:ligatures w14:val="none"/>
+        </w:rPr>
+        <w:t>🛡️</w:t>
+      </w:r>
+      <w:r>
+        <w:rPr>
+          <w:rFonts w:ascii="Arial" w:eastAsia="Times New Roman" w:hAnsi="Arial" w:cs="Arial"/>
+          <w:b/>
+          <w:bCs/>
+          <w:color w:val="3B3B3B"/>
+          <w:kern w:val="0"/>
+          <w:sz w:val="20"/>
+          <w:szCs w:val="20"/>
+          <w:bdr w:val="single" w:sz="2" w:space="0" w:color="auto" w:frame="1"/>
+          <w14:ligatures w14:val="none"/>
+        </w:rPr>
+        <w:t xml:space="preserve"> Dynamic Triple-Filter Configurator</w:t>
+      </w:r>
+      <w:r>
+        <w:rPr>
+          <w:rFonts w:ascii="Arial" w:eastAsia="Times New Roman" w:hAnsi="Arial" w:cs="Arial"/>
+          <w:color w:val="3B3B3B"/>
+          <w:kern w:val="0"/>
+          <w:sz w:val="20"/>
+          <w:szCs w:val="20"/>
+          <w14:ligatures w14:val="none"/>
+        </w:rPr>
+        <w:t>: Sliders and checkboxes to tweak Severity CVSS gates (0.0 to 10.0), Exploitability check standards (CISA KEV or EPSS &gt;10%), and Asset Tiers (Tier-1 Prod, etc.).</w:t>
+      </w:r>
+    </w:p>
+    <w:p>
+      <w:pPr>
+        <w:numPr>
+          <w:ilvl w:val="0"/>
+          <w:numId w:val="8"/>
+        </w:numPr>
+        <w:pBdr>
+          <w:top w:val="single" w:sz="2" w:space="0" w:color="auto"/>
+          <w:left w:val="single" w:sz="2" w:space="0" w:color="auto"/>
+          <w:bottom w:val="single" w:sz="2" w:space="0" w:color="auto"/>
+          <w:right w:val="single" w:sz="2" w:space="0" w:color="auto"/>
+        </w:pBdr>
+        <w:shd w:val="clear" w:color="auto" w:fill="F8F8F8"/>
+        <w:spacing w:before="100" w:beforeAutospacing="1" w:after="100" w:afterAutospacing="1" w:line="240" w:lineRule="auto"/>
+        <w:rPr>
+          <w:rFonts w:ascii="Arial" w:eastAsia="Times New Roman" w:hAnsi="Arial" w:cs="Arial"/>
+          <w:color w:val="3B3B3B"/>
+          <w:kern w:val="0"/>
+          <w:sz w:val="20"/>
+          <w:szCs w:val="20"/>
+          <w14:ligatures w14:val="none"/>
+        </w:rPr>
+      </w:pPr>
+      <w:r>
+        <w:rPr>
+          <w:rFonts w:ascii="Apple Color Emoji" w:eastAsia="Times New Roman" w:hAnsi="Apple Color Emoji" w:cs="Apple Color Emoji"/>
+          <w:b/>
+          <w:bCs/>
+          <w:color w:val="3B3B3B"/>
+          <w:kern w:val="0"/>
+          <w:sz w:val="20"/>
+          <w:szCs w:val="20"/>
+          <w:bdr w:val="single" w:sz="2" w:space="0" w:color="auto" w:frame="1"/>
+          <w14:ligatures w14:val="none"/>
+        </w:rPr>
+        <w:t>📈</w:t>
+      </w:r>
+      <w:r>
+        <w:rPr>
+          <w:rFonts w:ascii="Arial" w:eastAsia="Times New Roman" w:hAnsi="Arial" w:cs="Arial"/>
+          <w:b/>
+          <w:bCs/>
+          <w:color w:val="3B3B3B"/>
+          <w:kern w:val="0"/>
+          <w:sz w:val="20"/>
+          <w:szCs w:val="20"/>
+          <w:bdr w:val="single" w:sz="2" w:space="0" w:color="auto" w:frame="1"/>
+          <w14:ligatures w14:val="none"/>
+        </w:rPr>
+        <w:t xml:space="preserve"> Live Funnel Reduction Flow</w:t>
+      </w:r>
+      <w:r>
+        <w:rPr>
+          <w:rFonts w:ascii="Arial" w:eastAsia="Times New Roman" w:hAnsi="Arial" w:cs="Arial"/>
+          <w:color w:val="3B3B3B"/>
+          <w:kern w:val="0"/>
+          <w:sz w:val="20"/>
+          <w:szCs w:val="20"/>
+          <w14:ligatures w14:val="none"/>
+        </w:rPr>
+        <w:t>: A responsive before/after block showing raw findings (e.g. 10,000) dynamically dropping to parsed actionable items (e.g. 20-50) based on your custom active filters.</w:t>
+      </w:r>
+    </w:p>
+    <w:p>
+      <w:pPr>
+        <w:numPr>
+          <w:ilvl w:val="0"/>
+          <w:numId w:val="8"/>
+        </w:numPr>
+        <w:pBdr>
+          <w:top w:val="single" w:sz="2" w:space="0" w:color="auto"/>
+          <w:left w:val="single" w:sz="2" w:space="0" w:color="auto"/>
+          <w:bottom w:val="single" w:sz="2" w:space="0" w:color="auto"/>
+          <w:right w:val="single" w:sz="2" w:space="0" w:color="auto"/>
+        </w:pBdr>
+        <w:shd w:val="clear" w:color="auto" w:fill="F8F8F8"/>
+        <w:spacing w:before="100" w:beforeAutospacing="1" w:after="100" w:afterAutospacing="1" w:line="240" w:lineRule="auto"/>
+        <w:rPr>
+          <w:rFonts w:ascii="Arial" w:eastAsia="Times New Roman" w:hAnsi="Arial" w:cs="Arial"/>
+          <w:color w:val="3B3B3B"/>
+          <w:kern w:val="0"/>
+          <w:sz w:val="20"/>
+          <w:szCs w:val="20"/>
+          <w14:ligatures w14:val="none"/>
+        </w:rPr>
+      </w:pPr>
+      <w:r>
+        <w:rPr>
+          <w:rFonts w:ascii="Apple Color Emoji" w:eastAsia="Times New Roman" w:hAnsi="Apple Color Emoji" w:cs="Apple Color Emoji"/>
+          <w:b/>
+          <w:bCs/>
+          <w:color w:val="3B3B3B"/>
+          <w:kern w:val="0"/>
+          <w:sz w:val="20"/>
+          <w:szCs w:val="20"/>
+          <w:bdr w:val="single" w:sz="2" w:space="0" w:color="auto" w:frame="1"/>
+          <w14:ligatures w14:val="none"/>
+        </w:rPr>
+        <w:t>📊</w:t>
+      </w:r>
+      <w:r>
+        <w:rPr>
+          <w:rFonts w:ascii="Arial" w:eastAsia="Times New Roman" w:hAnsi="Arial" w:cs="Arial"/>
+          <w:b/>
+          <w:bCs/>
+          <w:color w:val="3B3B3B"/>
+          <w:kern w:val="0"/>
+          <w:sz w:val="20"/>
+          <w:szCs w:val="20"/>
+          <w:bdr w:val="single" w:sz="2" w:space="0" w:color="auto" w:frame="1"/>
+          <w14:ligatures w14:val="none"/>
+        </w:rPr>
+        <w:t xml:space="preserve"> 6 Dynamic homepage Metric Cards</w:t>
+      </w:r>
+      <w:r>
+        <w:rPr>
+          <w:rFonts w:ascii="Arial" w:eastAsia="Times New Roman" w:hAnsi="Arial" w:cs="Arial"/>
+          <w:color w:val="3B3B3B"/>
+          <w:kern w:val="0"/>
+          <w:sz w:val="20"/>
+          <w:szCs w:val="20"/>
+          <w14:ligatures w14:val="none"/>
+        </w:rPr>
+        <w:t>: High-fidelity, beautifully styled bar charts mapping Vuln Reduction, CVSS Distribution, EPSS Likelihood, Asset Tiers, KEV Coverage, and SLA breach risk.</w:t>
+      </w:r>
+    </w:p>
+    <w:p>
+      <w:pPr>
+        <w:numPr>
+          <w:ilvl w:val="0"/>
+          <w:numId w:val="8"/>
+        </w:numPr>
+        <w:pBdr>
+          <w:top w:val="single" w:sz="2" w:space="0" w:color="auto"/>
+          <w:left w:val="single" w:sz="2" w:space="0" w:color="auto"/>
+          <w:bottom w:val="single" w:sz="2" w:space="0" w:color="auto"/>
+          <w:right w:val="single" w:sz="2" w:space="0" w:color="auto"/>
+        </w:pBdr>
+        <w:shd w:val="clear" w:color="auto" w:fill="F8F8F8"/>
+        <w:spacing w:before="100" w:beforeAutospacing="1" w:after="100" w:afterAutospacing="1" w:line="240" w:lineRule="auto"/>
+        <w:rPr>
+          <w:rFonts w:ascii="Arial" w:eastAsia="Times New Roman" w:hAnsi="Arial" w:cs="Arial"/>
+          <w:color w:val="3B3B3B"/>
+          <w:kern w:val="0"/>
+          <w:sz w:val="20"/>
+          <w:szCs w:val="20"/>
+          <w14:ligatures w14:val="none"/>
+        </w:rPr>
+      </w:pPr>
+      <w:r>
+        <w:rPr>
+          <w:rFonts w:ascii="Apple Color Emoji" w:eastAsia="Times New Roman" w:hAnsi="Apple Color Emoji" w:cs="Apple Color Emoji"/>
+          <w:b/>
+          <w:bCs/>
+          <w:color w:val="3B3B3B"/>
+          <w:kern w:val="0"/>
+          <w:sz w:val="20"/>
+          <w:szCs w:val="20"/>
+          <w:bdr w:val="single" w:sz="2" w:space="0" w:color="auto" w:frame="1"/>
+          <w14:ligatures w14:val="none"/>
+        </w:rPr>
+        <w:t>📋</w:t>
+      </w:r>
+      <w:r>
+        <w:rPr>
+          <w:rFonts w:ascii="Arial" w:eastAsia="Times New Roman" w:hAnsi="Arial" w:cs="Arial"/>
+          <w:b/>
+          <w:bCs/>
+          <w:color w:val="3B3B3B"/>
+          <w:kern w:val="0"/>
+          <w:sz w:val="20"/>
+          <w:szCs w:val="20"/>
+          <w:bdr w:val="single" w:sz="2" w:space="0" w:color="auto" w:frame="1"/>
+          <w14:ligatures w14:val="none"/>
+        </w:rPr>
+        <w:t xml:space="preserve"> Parsed Actionable Findings Ledger</w:t>
+      </w:r>
+      <w:r>
+        <w:rPr>
+          <w:rFonts w:ascii="Arial" w:eastAsia="Times New Roman" w:hAnsi="Arial" w:cs="Arial"/>
+          <w:color w:val="3B3B3B"/>
+          <w:kern w:val="0"/>
+          <w:sz w:val="20"/>
+          <w:szCs w:val="20"/>
+          <w14:ligatures w14:val="none"/>
+        </w:rPr>
+        <w:t>: A ledger showing final prioritized findings, allowing simulated operations like </w:t>
+      </w:r>
+      <w:r>
+        <w:rPr>
+          <w:rFonts w:ascii="Arial" w:eastAsia="Times New Roman" w:hAnsi="Arial" w:cs="Arial"/>
+          <w:i/>
+          <w:iCs/>
+          <w:color w:val="3B3B3B"/>
+          <w:kern w:val="0"/>
+          <w:sz w:val="20"/>
+          <w:szCs w:val="20"/>
+          <w:bdr w:val="single" w:sz="2" w:space="0" w:color="auto" w:frame="1"/>
+          <w14:ligatures w14:val="none"/>
+        </w:rPr>
+        <w:t>"Dispatch to Jira"</w:t>
+      </w:r>
+      <w:r>
+        <w:rPr>
+          <w:rFonts w:ascii="Arial" w:eastAsia="Times New Roman" w:hAnsi="Arial" w:cs="Arial"/>
+          <w:color w:val="3B3B3B"/>
+          <w:kern w:val="0"/>
+          <w:sz w:val="20"/>
+          <w:szCs w:val="20"/>
+          <w14:ligatures w14:val="none"/>
+        </w:rPr>
+        <w:t> and </w:t>
+      </w:r>
+      <w:r>
+        <w:rPr>
+          <w:rFonts w:ascii="Arial" w:eastAsia="Times New Roman" w:hAnsi="Arial" w:cs="Arial"/>
+          <w:i/>
+          <w:iCs/>
+          <w:color w:val="3B3B3B"/>
+          <w:kern w:val="0"/>
+          <w:sz w:val="20"/>
+          <w:szCs w:val="20"/>
+          <w:bdr w:val="single" w:sz="2" w:space="0" w:color="auto" w:frame="1"/>
+          <w14:ligatures w14:val="none"/>
+        </w:rPr>
+        <w:t>"Run SOC Hot-Patch"</w:t>
+      </w:r>
+      <w:r>
+        <w:rPr>
+          <w:rFonts w:ascii="Arial" w:eastAsia="Times New Roman" w:hAnsi="Arial" w:cs="Arial"/>
+          <w:color w:val="3B3B3B"/>
+          <w:kern w:val="0"/>
+          <w:sz w:val="20"/>
+          <w:szCs w:val="20"/>
+          <w14:ligatures w14:val="none"/>
+        </w:rPr>
+        <w:t>.</w:t>
+      </w:r>
+    </w:p>
+    <w:p>
+      <w:pPr>
+        <w:pBdr>
+          <w:top w:val="single" w:sz="2" w:space="0" w:color="auto"/>
+          <w:left w:val="single" w:sz="2" w:space="0" w:color="auto"/>
+          <w:bottom w:val="single" w:sz="2" w:space="0" w:color="auto"/>
+          <w:right w:val="single" w:sz="2" w:space="0" w:color="auto"/>
+        </w:pBdr>
+        <w:shd w:val="clear" w:color="auto" w:fill="F8F8F8"/>
+        <w:spacing w:after="0" w:line="240" w:lineRule="auto"/>
+        <w:rPr>
+          <w:rFonts w:ascii="Arial" w:eastAsia="Times New Roman" w:hAnsi="Arial" w:cs="Arial"/>
+          <w:color w:val="3B3B3B"/>
+          <w:kern w:val="0"/>
+          <w:sz w:val="20"/>
+          <w:szCs w:val="20"/>
+          <w14:ligatures w14:val="none"/>
+        </w:rPr>
+      </w:pPr>
+      <w:r>
+        <w:rPr>
+          <w:rFonts w:ascii="Arial" w:eastAsia="Times New Roman" w:hAnsi="Arial" w:cs="Arial"/>
+          <w:color w:val="3B3B3B"/>
+          <w:kern w:val="0"/>
+          <w:sz w:val="20"/>
+          <w:szCs w:val="20"/>
+          <w14:ligatures w14:val="none"/>
+        </w:rPr>
+        <w:t>Please review and approve the </w:t>
+      </w:r>
+      <w:r>
+        <w:rPr>
+          <w:rFonts w:ascii="Arial" w:eastAsia="Times New Roman" w:hAnsi="Arial" w:cs="Arial"/>
+          <w:color w:val="3B3B3B"/>
+          <w:kern w:val="0"/>
+          <w:sz w:val="20"/>
+          <w:szCs w:val="20"/>
+          <w:bdr w:val="single" w:sz="2" w:space="0" w:color="auto" w:frame="1"/>
+          <w14:ligatures w14:val="none"/>
+        </w:rPr>
+        <w:t>implementation_plan.md</w:t>
+      </w:r>
+      <w:r>
+        <w:rPr>
+          <w:rFonts w:ascii="Arial" w:eastAsia="Times New Roman" w:hAnsi="Arial" w:cs="Arial"/>
+          <w:color w:val="3B3B3B"/>
+          <w:kern w:val="0"/>
+          <w:sz w:val="20"/>
+          <w:szCs w:val="20"/>
+          <w14:ligatures w14:val="none"/>
+        </w:rPr>
+        <w:t> and </w:t>
+      </w:r>
+      <w:r>
+        <w:rPr>
+          <w:rFonts w:ascii="Arial" w:eastAsia="Times New Roman" w:hAnsi="Arial" w:cs="Arial"/>
+          <w:color w:val="3B3B3B"/>
+          <w:kern w:val="0"/>
+          <w:sz w:val="20"/>
+          <w:szCs w:val="20"/>
+          <w:bdr w:val="single" w:sz="2" w:space="0" w:color="auto" w:frame="1"/>
+          <w14:ligatures w14:val="none"/>
+        </w:rPr>
+        <w:t>task.md</w:t>
+      </w:r>
+      <w:r>
+        <w:rPr>
+          <w:rFonts w:ascii="Arial" w:eastAsia="Times New Roman" w:hAnsi="Arial" w:cs="Arial"/>
+          <w:color w:val="3B3B3B"/>
+          <w:kern w:val="0"/>
+          <w:sz w:val="20"/>
+          <w:szCs w:val="20"/>
+          <w14:ligatures w14:val="none"/>
+        </w:rPr>
+        <w:t> checklists so I can begin execution!</w:t>
       </w:r>
     </w:p>
     <w:p/>
@@ -2575,6 +4237,240 @@
     </w:lvl>
   </w:abstractNum>
   <w:abstractNum w:abstractNumId="4" w15:restartNumberingAfterBreak="0">
+    <w:nsid w:val="58EF0F53"/>
+    <w:multiLevelType w:val="multilevel"/>
+    <w:tmpl w:val="214CD316"/>
+    <w:lvl w:ilvl="0">
+      <w:start w:val="1"/>
+      <w:numFmt w:val="decimal"/>
+      <w:lvlText w:val="%1."/>
+      <w:lvlJc w:val="left"/>
+      <w:pPr>
+        <w:tabs>
+          <w:tab w:val="num" w:pos="720"/>
+        </w:tabs>
+        <w:ind w:left="720" w:hanging="360"/>
+      </w:pPr>
+    </w:lvl>
+    <w:lvl w:ilvl="1" w:tentative="1">
+      <w:start w:val="1"/>
+      <w:numFmt w:val="decimal"/>
+      <w:lvlText w:val="%2."/>
+      <w:lvlJc w:val="left"/>
+      <w:pPr>
+        <w:tabs>
+          <w:tab w:val="num" w:pos="1440"/>
+        </w:tabs>
+        <w:ind w:left="1440" w:hanging="360"/>
+      </w:pPr>
+    </w:lvl>
+    <w:lvl w:ilvl="2" w:tentative="1">
+      <w:start w:val="1"/>
+      <w:numFmt w:val="decimal"/>
+      <w:lvlText w:val="%3."/>
+      <w:lvlJc w:val="left"/>
+      <w:pPr>
+        <w:tabs>
+          <w:tab w:val="num" w:pos="2160"/>
+        </w:tabs>
+        <w:ind w:left="2160" w:hanging="360"/>
+      </w:pPr>
+    </w:lvl>
+    <w:lvl w:ilvl="3" w:tentative="1">
+      <w:start w:val="1"/>
+      <w:numFmt w:val="decimal"/>
+      <w:lvlText w:val="%4."/>
+      <w:lvlJc w:val="left"/>
+      <w:pPr>
+        <w:tabs>
+          <w:tab w:val="num" w:pos="2880"/>
+        </w:tabs>
+        <w:ind w:left="2880" w:hanging="360"/>
+      </w:pPr>
+    </w:lvl>
+    <w:lvl w:ilvl="4" w:tentative="1">
+      <w:start w:val="1"/>
+      <w:numFmt w:val="decimal"/>
+      <w:lvlText w:val="%5."/>
+      <w:lvlJc w:val="left"/>
+      <w:pPr>
+        <w:tabs>
+          <w:tab w:val="num" w:pos="3600"/>
+        </w:tabs>
+        <w:ind w:left="3600" w:hanging="360"/>
+      </w:pPr>
+    </w:lvl>
+    <w:lvl w:ilvl="5" w:tentative="1">
+      <w:start w:val="1"/>
+      <w:numFmt w:val="decimal"/>
+      <w:lvlText w:val="%6."/>
+      <w:lvlJc w:val="left"/>
+      <w:pPr>
+        <w:tabs>
+          <w:tab w:val="num" w:pos="4320"/>
+        </w:tabs>
+        <w:ind w:left="4320" w:hanging="360"/>
+      </w:pPr>
+    </w:lvl>
+    <w:lvl w:ilvl="6" w:tentative="1">
+      <w:start w:val="1"/>
+      <w:numFmt w:val="decimal"/>
+      <w:lvlText w:val="%7."/>
+      <w:lvlJc w:val="left"/>
+      <w:pPr>
+        <w:tabs>
+          <w:tab w:val="num" w:pos="5040"/>
+        </w:tabs>
+        <w:ind w:left="5040" w:hanging="360"/>
+      </w:pPr>
+    </w:lvl>
+    <w:lvl w:ilvl="7" w:tentative="1">
+      <w:start w:val="1"/>
+      <w:numFmt w:val="decimal"/>
+      <w:lvlText w:val="%8."/>
+      <w:lvlJc w:val="left"/>
+      <w:pPr>
+        <w:tabs>
+          <w:tab w:val="num" w:pos="5760"/>
+        </w:tabs>
+        <w:ind w:left="5760" w:hanging="360"/>
+      </w:pPr>
+    </w:lvl>
+    <w:lvl w:ilvl="8" w:tentative="1">
+      <w:start w:val="1"/>
+      <w:numFmt w:val="decimal"/>
+      <w:lvlText w:val="%9."/>
+      <w:lvlJc w:val="left"/>
+      <w:pPr>
+        <w:tabs>
+          <w:tab w:val="num" w:pos="6480"/>
+        </w:tabs>
+        <w:ind w:left="6480" w:hanging="360"/>
+      </w:pPr>
+    </w:lvl>
+  </w:abstractNum>
+  <w:abstractNum w:abstractNumId="5" w15:restartNumberingAfterBreak="0">
+    <w:nsid w:val="5D53714D"/>
+    <w:multiLevelType w:val="multilevel"/>
+    <w:tmpl w:val="B52ABD04"/>
+    <w:lvl w:ilvl="0">
+      <w:start w:val="1"/>
+      <w:numFmt w:val="decimal"/>
+      <w:lvlText w:val="%1."/>
+      <w:lvlJc w:val="left"/>
+      <w:pPr>
+        <w:tabs>
+          <w:tab w:val="num" w:pos="720"/>
+        </w:tabs>
+        <w:ind w:left="720" w:hanging="360"/>
+      </w:pPr>
+    </w:lvl>
+    <w:lvl w:ilvl="1">
+      <w:start w:val="1"/>
+      <w:numFmt w:val="bullet"/>
+      <w:lvlText w:val=""/>
+      <w:lvlJc w:val="left"/>
+      <w:pPr>
+        <w:tabs>
+          <w:tab w:val="num" w:pos="1440"/>
+        </w:tabs>
+        <w:ind w:left="1440" w:hanging="360"/>
+      </w:pPr>
+      <w:rPr>
+        <w:rFonts w:ascii="Symbol" w:hAnsi="Symbol" w:hint="default"/>
+        <w:sz w:val="20"/>
+      </w:rPr>
+    </w:lvl>
+    <w:lvl w:ilvl="2">
+      <w:start w:val="1"/>
+      <w:numFmt w:val="bullet"/>
+      <w:lvlText w:val=""/>
+      <w:lvlJc w:val="left"/>
+      <w:pPr>
+        <w:tabs>
+          <w:tab w:val="num" w:pos="2160"/>
+        </w:tabs>
+        <w:ind w:left="2160" w:hanging="360"/>
+      </w:pPr>
+      <w:rPr>
+        <w:rFonts w:ascii="Symbol" w:hAnsi="Symbol" w:hint="default"/>
+        <w:sz w:val="20"/>
+      </w:rPr>
+    </w:lvl>
+    <w:lvl w:ilvl="3" w:tentative="1">
+      <w:start w:val="1"/>
+      <w:numFmt w:val="decimal"/>
+      <w:lvlText w:val="%4."/>
+      <w:lvlJc w:val="left"/>
+      <w:pPr>
+        <w:tabs>
+          <w:tab w:val="num" w:pos="2880"/>
+        </w:tabs>
+        <w:ind w:left="2880" w:hanging="360"/>
+      </w:pPr>
+    </w:lvl>
+    <w:lvl w:ilvl="4" w:tentative="1">
+      <w:start w:val="1"/>
+      <w:numFmt w:val="decimal"/>
+      <w:lvlText w:val="%5."/>
+      <w:lvlJc w:val="left"/>
+      <w:pPr>
+        <w:tabs>
+          <w:tab w:val="num" w:pos="3600"/>
+        </w:tabs>
+        <w:ind w:left="3600" w:hanging="360"/>
+      </w:pPr>
+    </w:lvl>
+    <w:lvl w:ilvl="5" w:tentative="1">
+      <w:start w:val="1"/>
+      <w:numFmt w:val="decimal"/>
+      <w:lvlText w:val="%6."/>
+      <w:lvlJc w:val="left"/>
+      <w:pPr>
+        <w:tabs>
+          <w:tab w:val="num" w:pos="4320"/>
+        </w:tabs>
+        <w:ind w:left="4320" w:hanging="360"/>
+      </w:pPr>
+    </w:lvl>
+    <w:lvl w:ilvl="6" w:tentative="1">
+      <w:start w:val="1"/>
+      <w:numFmt w:val="decimal"/>
+      <w:lvlText w:val="%7."/>
+      <w:lvlJc w:val="left"/>
+      <w:pPr>
+        <w:tabs>
+          <w:tab w:val="num" w:pos="5040"/>
+        </w:tabs>
+        <w:ind w:left="5040" w:hanging="360"/>
+      </w:pPr>
+    </w:lvl>
+    <w:lvl w:ilvl="7" w:tentative="1">
+      <w:start w:val="1"/>
+      <w:numFmt w:val="decimal"/>
+      <w:lvlText w:val="%8."/>
+      <w:lvlJc w:val="left"/>
+      <w:pPr>
+        <w:tabs>
+          <w:tab w:val="num" w:pos="5760"/>
+        </w:tabs>
+        <w:ind w:left="5760" w:hanging="360"/>
+      </w:pPr>
+    </w:lvl>
+    <w:lvl w:ilvl="8" w:tentative="1">
+      <w:start w:val="1"/>
+      <w:numFmt w:val="decimal"/>
+      <w:lvlText w:val="%9."/>
+      <w:lvlJc w:val="left"/>
+      <w:pPr>
+        <w:tabs>
+          <w:tab w:val="num" w:pos="6480"/>
+        </w:tabs>
+        <w:ind w:left="6480" w:hanging="360"/>
+      </w:pPr>
+    </w:lvl>
+  </w:abstractNum>
+  <w:abstractNum w:abstractNumId="6" w15:restartNumberingAfterBreak="0">
     <w:nsid w:val="6A4B1795"/>
     <w:multiLevelType w:val="multilevel"/>
     <w:tmpl w:val="AA669F3E"/>
@@ -2723,8 +4619,157 @@
       </w:rPr>
     </w:lvl>
   </w:abstractNum>
+  <w:abstractNum w:abstractNumId="7" w15:restartNumberingAfterBreak="0">
+    <w:nsid w:val="79DC4D3C"/>
+    <w:multiLevelType w:val="multilevel"/>
+    <w:tmpl w:val="80FE2780"/>
+    <w:lvl w:ilvl="0">
+      <w:start w:val="1"/>
+      <w:numFmt w:val="bullet"/>
+      <w:lvlText w:val=""/>
+      <w:lvlJc w:val="left"/>
+      <w:pPr>
+        <w:tabs>
+          <w:tab w:val="num" w:pos="720"/>
+        </w:tabs>
+        <w:ind w:left="720" w:hanging="360"/>
+      </w:pPr>
+      <w:rPr>
+        <w:rFonts w:ascii="Symbol" w:hAnsi="Symbol" w:hint="default"/>
+        <w:sz w:val="20"/>
+      </w:rPr>
+    </w:lvl>
+    <w:lvl w:ilvl="1" w:tentative="1">
+      <w:start w:val="1"/>
+      <w:numFmt w:val="bullet"/>
+      <w:lvlText w:val=""/>
+      <w:lvlJc w:val="left"/>
+      <w:pPr>
+        <w:tabs>
+          <w:tab w:val="num" w:pos="1440"/>
+        </w:tabs>
+        <w:ind w:left="1440" w:hanging="360"/>
+      </w:pPr>
+      <w:rPr>
+        <w:rFonts w:ascii="Symbol" w:hAnsi="Symbol" w:hint="default"/>
+        <w:sz w:val="20"/>
+      </w:rPr>
+    </w:lvl>
+    <w:lvl w:ilvl="2" w:tentative="1">
+      <w:start w:val="1"/>
+      <w:numFmt w:val="bullet"/>
+      <w:lvlText w:val=""/>
+      <w:lvlJc w:val="left"/>
+      <w:pPr>
+        <w:tabs>
+          <w:tab w:val="num" w:pos="2160"/>
+        </w:tabs>
+        <w:ind w:left="2160" w:hanging="360"/>
+      </w:pPr>
+      <w:rPr>
+        <w:rFonts w:ascii="Symbol" w:hAnsi="Symbol" w:hint="default"/>
+        <w:sz w:val="20"/>
+      </w:rPr>
+    </w:lvl>
+    <w:lvl w:ilvl="3" w:tentative="1">
+      <w:start w:val="1"/>
+      <w:numFmt w:val="bullet"/>
+      <w:lvlText w:val=""/>
+      <w:lvlJc w:val="left"/>
+      <w:pPr>
+        <w:tabs>
+          <w:tab w:val="num" w:pos="2880"/>
+        </w:tabs>
+        <w:ind w:left="2880" w:hanging="360"/>
+      </w:pPr>
+      <w:rPr>
+        <w:rFonts w:ascii="Symbol" w:hAnsi="Symbol" w:hint="default"/>
+        <w:sz w:val="20"/>
+      </w:rPr>
+    </w:lvl>
+    <w:lvl w:ilvl="4" w:tentative="1">
+      <w:start w:val="1"/>
+      <w:numFmt w:val="bullet"/>
+      <w:lvlText w:val=""/>
+      <w:lvlJc w:val="left"/>
+      <w:pPr>
+        <w:tabs>
+          <w:tab w:val="num" w:pos="3600"/>
+        </w:tabs>
+        <w:ind w:left="3600" w:hanging="360"/>
+      </w:pPr>
+      <w:rPr>
+        <w:rFonts w:ascii="Symbol" w:hAnsi="Symbol" w:hint="default"/>
+        <w:sz w:val="20"/>
+      </w:rPr>
+    </w:lvl>
+    <w:lvl w:ilvl="5" w:tentative="1">
+      <w:start w:val="1"/>
+      <w:numFmt w:val="bullet"/>
+      <w:lvlText w:val=""/>
+      <w:lvlJc w:val="left"/>
+      <w:pPr>
+        <w:tabs>
+          <w:tab w:val="num" w:pos="4320"/>
+        </w:tabs>
+        <w:ind w:left="4320" w:hanging="360"/>
+      </w:pPr>
+      <w:rPr>
+        <w:rFonts w:ascii="Symbol" w:hAnsi="Symbol" w:hint="default"/>
+        <w:sz w:val="20"/>
+      </w:rPr>
+    </w:lvl>
+    <w:lvl w:ilvl="6" w:tentative="1">
+      <w:start w:val="1"/>
+      <w:numFmt w:val="bullet"/>
+      <w:lvlText w:val=""/>
+      <w:lvlJc w:val="left"/>
+      <w:pPr>
+        <w:tabs>
+          <w:tab w:val="num" w:pos="5040"/>
+        </w:tabs>
+        <w:ind w:left="5040" w:hanging="360"/>
+      </w:pPr>
+      <w:rPr>
+        <w:rFonts w:ascii="Symbol" w:hAnsi="Symbol" w:hint="default"/>
+        <w:sz w:val="20"/>
+      </w:rPr>
+    </w:lvl>
+    <w:lvl w:ilvl="7" w:tentative="1">
+      <w:start w:val="1"/>
+      <w:numFmt w:val="bullet"/>
+      <w:lvlText w:val=""/>
+      <w:lvlJc w:val="left"/>
+      <w:pPr>
+        <w:tabs>
+          <w:tab w:val="num" w:pos="5760"/>
+        </w:tabs>
+        <w:ind w:left="5760" w:hanging="360"/>
+      </w:pPr>
+      <w:rPr>
+        <w:rFonts w:ascii="Symbol" w:hAnsi="Symbol" w:hint="default"/>
+        <w:sz w:val="20"/>
+      </w:rPr>
+    </w:lvl>
+    <w:lvl w:ilvl="8" w:tentative="1">
+      <w:start w:val="1"/>
+      <w:numFmt w:val="bullet"/>
+      <w:lvlText w:val=""/>
+      <w:lvlJc w:val="left"/>
+      <w:pPr>
+        <w:tabs>
+          <w:tab w:val="num" w:pos="6480"/>
+        </w:tabs>
+        <w:ind w:left="6480" w:hanging="360"/>
+      </w:pPr>
+      <w:rPr>
+        <w:rFonts w:ascii="Symbol" w:hAnsi="Symbol" w:hint="default"/>
+        <w:sz w:val="20"/>
+      </w:rPr>
+    </w:lvl>
+  </w:abstractNum>
   <w:num w:numId="1" w16cid:durableId="1428619264">
-    <w:abstractNumId w:val="4"/>
+    <w:abstractNumId w:val="6"/>
   </w:num>
   <w:num w:numId="2" w16cid:durableId="1274436865">
     <w:abstractNumId w:val="0"/>
@@ -2737,6 +4782,15 @@
   </w:num>
   <w:num w:numId="5" w16cid:durableId="1544906806">
     <w:abstractNumId w:val="1"/>
+  </w:num>
+  <w:num w:numId="6" w16cid:durableId="1795899876">
+    <w:abstractNumId w:val="5"/>
+  </w:num>
+  <w:num w:numId="7" w16cid:durableId="1907256410">
+    <w:abstractNumId w:val="7"/>
+  </w:num>
+  <w:num w:numId="8" w16cid:durableId="975187850">
+    <w:abstractNumId w:val="4"/>
   </w:num>
 </w:numbering>
 </file>
@@ -3706,6 +5760,17 @@
     <w:basedOn w:val="DefaultParagraphFont"/>
     <w:rsid w:val="002D3832"/>
   </w:style>
+  <w:style w:type="character" w:styleId="Emphasis">
+    <w:name w:val="Emphasis"/>
+    <w:basedOn w:val="DefaultParagraphFont"/>
+    <w:uiPriority w:val="20"/>
+    <w:qFormat/>
+    <w:rsid w:val="00C615F6"/>
+    <w:rPr>
+      <w:i/>
+      <w:iCs/>
+    </w:rPr>
+  </w:style>
 </w:styles>
 </file>
 

</xml_diff>